<commit_message>
Added hackathon coordination workflow and updated operations report
</commit_message>
<xml_diff>
--- a/01_Report/MunichTech_EXPO_Operations_Proposal_Starter.docx
+++ b/01_Report/MunichTech_EXPO_Operations_Proposal_Starter.docx
@@ -1119,6 +1119,190 @@
         <w:br/>
       </w:r>
     </w:p>
+    <w:p/>
+    <w:p/>
+    <w:p>
+      <w:pPr>
+        <w:pStyle w:val="Heading1"/>
+      </w:pPr>
+      <w:r>
+        <w:t>AI-Enhanced Hackathon Coordination Workflow</w:t>
+      </w:r>
+    </w:p>
+    <w:p>
+      <w:pPr>
+        <w:rPr>
+          <w:lang w:val="en-GB"/>
+        </w:rPr>
+      </w:pPr>
+      <w:r>
+        <w:rPr>
+          <w:lang w:val="en-GB"/>
+        </w:rPr>
+        <w:t xml:space="preserve">The AI-Enhanced Hackathon Coordination Workflow was designed to support efficient operational management for the </w:t>
+      </w:r>
+      <w:proofErr w:type="spellStart"/>
+      <w:r>
+        <w:rPr>
+          <w:lang w:val="en-GB"/>
+        </w:rPr>
+        <w:t>MunichTech</w:t>
+      </w:r>
+      <w:proofErr w:type="spellEnd"/>
+      <w:r>
+        <w:rPr>
+          <w:lang w:val="en-GB"/>
+        </w:rPr>
+        <w:t xml:space="preserve"> EXPO 2026 hackathon environment. The workflow combines structured event coordination processes with AI-supported automation features to improve onboarding, communication, execution monitoring, and evaluation activities throughout the hackathon lifecycle.</w:t>
+      </w:r>
+    </w:p>
+    <w:p>
+      <w:pPr>
+        <w:rPr>
+          <w:lang w:val="en-GB"/>
+        </w:rPr>
+      </w:pPr>
+      <w:r>
+        <w:rPr>
+          <w:lang w:val="en-GB"/>
+        </w:rPr>
+        <w:t>The coordination structure is divided into three operational phases: onboarding, execution, and evaluation. This structure helps reduce operational complexity while ensuring that participants, mentors, sponsors, judges, and organizers remain aligned during the event.</w:t>
+      </w:r>
+      <w:r>
+        <w:rPr>
+          <w:lang w:val="en-GB"/>
+        </w:rPr>
+        <w:t xml:space="preserve"> </w:t>
+      </w:r>
+      <w:r>
+        <w:rPr>
+          <w:lang w:val="en-GB"/>
+        </w:rPr>
+        <w:t xml:space="preserve">During the onboarding phase, participants complete registration and provide information regarding their technical skills, interests, and preferred challenge areas. AI-supported </w:t>
+      </w:r>
+      <w:r>
+        <w:rPr>
+          <w:lang w:val="en-GB"/>
+        </w:rPr>
+        <w:lastRenderedPageBreak/>
+        <w:t>profile analysis assists organizers in understanding participant capabilities, while AI team-matching systems help create balanced and collaborative teams based on skills and interests. Once teams are formed, challenge assignments are distributed according to sponsor categories and hackathon objectives.</w:t>
+      </w:r>
+    </w:p>
+    <w:p>
+      <w:pPr>
+        <w:rPr>
+          <w:lang w:val="en-GB"/>
+        </w:rPr>
+      </w:pPr>
+      <w:r>
+        <w:rPr>
+          <w:lang w:val="en-GB"/>
+        </w:rPr>
+        <w:t>The execution phase focuses on operational coordination and participant support throughout the hackathon. Mentor coordination ensures that each team receives guidance and technical support during development activities. Progress checkpoints allow organizers to monitor team advancement and identify operational bottlenecks early. AI-supported monitoring tools help track participation activity, submission readiness, and engagement levels during the execution process. Submission collection and validation processes also help ensure that all project submissions follow the required hackathon guidelines and deadlines.</w:t>
+      </w:r>
+    </w:p>
+    <w:p>
+      <w:pPr>
+        <w:rPr>
+          <w:lang w:val="en-GB"/>
+        </w:rPr>
+      </w:pPr>
+      <w:r>
+        <w:rPr>
+          <w:lang w:val="en-GB"/>
+        </w:rPr>
+        <w:t xml:space="preserve">The evaluation phase supports judging coordination, score aggregation, winner selection, and participant feedback collection. AI-generated score summarization assists judges by organizing evaluation results efficiently across multiple teams and categories. AI-supported sentiment analysis also helps organizers </w:t>
+      </w:r>
+      <w:proofErr w:type="spellStart"/>
+      <w:r>
+        <w:rPr>
+          <w:lang w:val="en-GB"/>
+        </w:rPr>
+        <w:t>analyze</w:t>
+      </w:r>
+      <w:proofErr w:type="spellEnd"/>
+      <w:r>
+        <w:rPr>
+          <w:lang w:val="en-GB"/>
+        </w:rPr>
+        <w:t xml:space="preserve"> participant feedback and overall hackathon engagement after the event.</w:t>
+      </w:r>
+    </w:p>
+    <w:p>
+      <w:pPr>
+        <w:rPr>
+          <w:lang w:val="en-GB"/>
+        </w:rPr>
+      </w:pPr>
+      <w:r>
+        <w:rPr>
+          <w:lang w:val="en-GB"/>
+        </w:rPr>
+        <w:t xml:space="preserve">The overall workflow improves operational scalability, coordination efficiency, and communication management for high-participant event environments. By integrating AI-supported systems into the coordination process, </w:t>
+      </w:r>
+      <w:proofErr w:type="spellStart"/>
+      <w:r>
+        <w:rPr>
+          <w:lang w:val="en-GB"/>
+        </w:rPr>
+        <w:t>MunichTech</w:t>
+      </w:r>
+      <w:proofErr w:type="spellEnd"/>
+      <w:r>
+        <w:rPr>
+          <w:lang w:val="en-GB"/>
+        </w:rPr>
+        <w:t xml:space="preserve"> EXPO 2026 can reduce operational bottlenecks, improve decision-making visibility, and support a more organized and scalable hackathon experience for participants, mentors, sponsors, and event organizers.</w:t>
+      </w:r>
+    </w:p>
+    <w:p>
+      <w:pPr>
+        <w:rPr>
+          <w:lang w:val="en-GB"/>
+        </w:rPr>
+      </w:pPr>
+      <w:r>
+        <w:rPr>
+          <w:noProof/>
+          <w:lang w:val="en-GB"/>
+        </w:rPr>
+        <w:drawing>
+          <wp:inline distT="0" distB="0" distL="0" distR="0" wp14:anchorId="0CB30F87" wp14:editId="75739F98">
+            <wp:extent cx="5486400" cy="3086100"/>
+            <wp:effectExtent l="0" t="0" r="0" b="0"/>
+            <wp:docPr id="822151043" name="Picture 1"/>
+            <wp:cNvGraphicFramePr>
+              <a:graphicFrameLocks xmlns:a="http://schemas.openxmlformats.org/drawingml/2006/main" noChangeAspect="1"/>
+            </wp:cNvGraphicFramePr>
+            <a:graphic xmlns:a="http://schemas.openxmlformats.org/drawingml/2006/main">
+              <a:graphicData uri="http://schemas.openxmlformats.org/drawingml/2006/picture">
+                <pic:pic xmlns:pic="http://schemas.openxmlformats.org/drawingml/2006/picture">
+                  <pic:nvPicPr>
+                    <pic:cNvPr id="822151043" name="Picture 822151043"/>
+                    <pic:cNvPicPr/>
+                  </pic:nvPicPr>
+                  <pic:blipFill>
+                    <a:blip r:embed="rId6"/>
+                    <a:stretch>
+                      <a:fillRect/>
+                    </a:stretch>
+                  </pic:blipFill>
+                  <pic:spPr>
+                    <a:xfrm>
+                      <a:off x="0" y="0"/>
+                      <a:ext cx="5486400" cy="3086100"/>
+                    </a:xfrm>
+                    <a:prstGeom prst="rect">
+                      <a:avLst/>
+                    </a:prstGeom>
+                  </pic:spPr>
+                </pic:pic>
+              </a:graphicData>
+            </a:graphic>
+          </wp:inline>
+        </w:drawing>
+      </w:r>
+    </w:p>
     <w:sectPr>
       <w:pgSz w:w="12240" w:h="15840"/>
       <w:pgMar w:top="1440" w:right="1800" w:bottom="1440" w:left="1800" w:header="720" w:footer="720" w:gutter="0"/>
@@ -1935,7 +2119,6 @@
   <w:style w:type="character" w:default="1" w:styleId="DefaultParagraphFont">
     <w:name w:val="Default Paragraph Font"/>
     <w:uiPriority w:val="1"/>
-    <w:semiHidden/>
     <w:unhideWhenUsed/>
   </w:style>
   <w:style w:type="table" w:default="1" w:styleId="TableNormal">

</xml_diff>

<commit_message>
Added AI-supported workflow automation documentation
</commit_message>
<xml_diff>
--- a/01_Report/MunichTech_EXPO_Operations_Proposal_Starter.docx
+++ b/01_Report/MunichTech_EXPO_Operations_Proposal_Starter.docx
@@ -1303,6 +1303,579 @@
         </w:drawing>
       </w:r>
     </w:p>
+    <w:p>
+      <w:pPr>
+        <w:pStyle w:val="Heading1"/>
+      </w:pPr>
+      <w:r>
+        <w:lastRenderedPageBreak/>
+        <w:t>AI-Supported Workflow Automations</w:t>
+      </w:r>
+    </w:p>
+    <w:p>
+      <w:r>
+        <w:t xml:space="preserve">The </w:t>
+      </w:r>
+      <w:proofErr w:type="spellStart"/>
+      <w:r>
+        <w:t>MunichTech</w:t>
+      </w:r>
+      <w:proofErr w:type="spellEnd"/>
+      <w:r>
+        <w:t xml:space="preserve"> EXPO 2026 operational framework integrates AI-supported workflow automations to improve coordination efficiency, reduce operational bottlenecks, and support scalable event execution. These automations are designed to enhance communication, monitoring, reporting, participant coordination, and operational decision-making across multiple event activities.</w:t>
+      </w:r>
+    </w:p>
+    <w:p>
+      <w:pPr>
+        <w:pStyle w:val="Heading2"/>
+      </w:pPr>
+      <w:r>
+        <w:t>AI-Supported Operational Automations</w:t>
+      </w:r>
+    </w:p>
+    <w:tbl>
+      <w:tblPr>
+        <w:tblStyle w:val="TableGrid"/>
+        <w:tblW w:w="0" w:type="auto"/>
+        <w:tblLook w:val="04A0" w:firstRow="1" w:lastRow="0" w:firstColumn="1" w:lastColumn="0" w:noHBand="0" w:noVBand="1"/>
+      </w:tblPr>
+      <w:tblGrid>
+        <w:gridCol w:w="1628"/>
+        <w:gridCol w:w="2279"/>
+        <w:gridCol w:w="2569"/>
+        <w:gridCol w:w="2154"/>
+      </w:tblGrid>
+      <w:tr>
+        <w:tc>
+          <w:tcPr>
+            <w:tcW w:w="0" w:type="auto"/>
+          </w:tcPr>
+          <w:p>
+            <w:r>
+              <w:t>Automation</w:t>
+            </w:r>
+          </w:p>
+        </w:tc>
+        <w:tc>
+          <w:tcPr>
+            <w:tcW w:w="0" w:type="auto"/>
+          </w:tcPr>
+          <w:p>
+            <w:r>
+              <w:t xml:space="preserve">Problem </w:t>
+            </w:r>
+          </w:p>
+        </w:tc>
+        <w:tc>
+          <w:tcPr>
+            <w:tcW w:w="0" w:type="auto"/>
+          </w:tcPr>
+          <w:p>
+            <w:r>
+              <w:t xml:space="preserve">Workflow </w:t>
+            </w:r>
+          </w:p>
+        </w:tc>
+        <w:tc>
+          <w:tcPr>
+            <w:tcW w:w="0" w:type="auto"/>
+          </w:tcPr>
+          <w:p>
+            <w:r>
+              <w:t>Expected Impact</w:t>
+            </w:r>
+          </w:p>
+        </w:tc>
+      </w:tr>
+      <w:tr>
+        <w:tc>
+          <w:tcPr>
+            <w:tcW w:w="0" w:type="auto"/>
+          </w:tcPr>
+          <w:p>
+            <w:r>
+              <w:t>AI Sponsor Onboarding Automation</w:t>
+            </w:r>
+          </w:p>
+        </w:tc>
+        <w:tc>
+          <w:tcPr>
+            <w:tcW w:w="0" w:type="auto"/>
+          </w:tcPr>
+          <w:p>
+            <w:r>
+              <w:t>Manual sponsor coordination and branding follow-ups may cause delays during onboarding processes.</w:t>
+            </w:r>
+          </w:p>
+        </w:tc>
+        <w:tc>
+          <w:tcPr>
+            <w:tcW w:w="0" w:type="auto"/>
+          </w:tcPr>
+          <w:tbl>
+            <w:tblPr>
+              <w:tblW w:w="0" w:type="auto"/>
+              <w:tblCellSpacing w:w="15" w:type="dxa"/>
+              <w:tblCellMar>
+                <w:top w:w="15" w:type="dxa"/>
+                <w:left w:w="15" w:type="dxa"/>
+                <w:bottom w:w="15" w:type="dxa"/>
+                <w:right w:w="15" w:type="dxa"/>
+              </w:tblCellMar>
+              <w:tblLook w:val="04A0" w:firstRow="1" w:lastRow="0" w:firstColumn="1" w:lastColumn="0" w:noHBand="0" w:noVBand="1"/>
+            </w:tblPr>
+            <w:tblGrid>
+              <w:gridCol w:w="1942"/>
+            </w:tblGrid>
+            <w:tr>
+              <w:trPr>
+                <w:tblCellSpacing w:w="15" w:type="dxa"/>
+              </w:trPr>
+              <w:tc>
+                <w:tcPr>
+                  <w:tcW w:w="0" w:type="auto"/>
+                  <w:vAlign w:val="center"/>
+                  <w:hideMark/>
+                </w:tcPr>
+                <w:p>
+                  <w:pPr>
+                    <w:spacing w:after="0" w:line="240" w:lineRule="auto"/>
+                    <w:rPr>
+                      <w:lang w:val="en-GB"/>
+                    </w:rPr>
+                  </w:pPr>
+                  <w:r>
+                    <w:rPr>
+                      <w:lang w:val="en-GB"/>
+                    </w:rPr>
+                    <w:t>may cause delays during onboarding processes.</w:t>
+                  </w:r>
+                </w:p>
+              </w:tc>
+            </w:tr>
+          </w:tbl>
+          <w:p>
+            <w:pPr>
+              <w:rPr>
+                <w:vanish/>
+                <w:lang w:val="en-GB"/>
+              </w:rPr>
+            </w:pPr>
+          </w:p>
+          <w:tbl>
+            <w:tblPr>
+              <w:tblW w:w="0" w:type="auto"/>
+              <w:tblCellSpacing w:w="15" w:type="dxa"/>
+              <w:tblCellMar>
+                <w:top w:w="15" w:type="dxa"/>
+                <w:left w:w="15" w:type="dxa"/>
+                <w:bottom w:w="15" w:type="dxa"/>
+                <w:right w:w="15" w:type="dxa"/>
+              </w:tblCellMar>
+              <w:tblLook w:val="04A0" w:firstRow="1" w:lastRow="0" w:firstColumn="1" w:lastColumn="0" w:noHBand="0" w:noVBand="1"/>
+            </w:tblPr>
+            <w:tblGrid>
+              <w:gridCol w:w="1942"/>
+            </w:tblGrid>
+            <w:tr>
+              <w:trPr>
+                <w:tblCellSpacing w:w="15" w:type="dxa"/>
+              </w:trPr>
+              <w:tc>
+                <w:tcPr>
+                  <w:tcW w:w="0" w:type="auto"/>
+                  <w:vAlign w:val="center"/>
+                  <w:hideMark/>
+                </w:tcPr>
+                <w:p>
+                  <w:pPr>
+                    <w:spacing w:after="0" w:line="240" w:lineRule="auto"/>
+                    <w:rPr>
+                      <w:lang w:val="en-GB"/>
+                    </w:rPr>
+                  </w:pPr>
+                  <w:r>
+                    <w:rPr>
+                      <w:lang w:val="en-GB"/>
+                    </w:rPr>
+                    <w:t>AI-generated reminders and automated onboarding tracking support branding submissions, communication updates, and sponsor coordination activities.</w:t>
+                  </w:r>
+                </w:p>
+              </w:tc>
+            </w:tr>
+          </w:tbl>
+          <w:p>
+            <w:pPr>
+              <w:rPr>
+                <w:lang w:val="en-GB"/>
+              </w:rPr>
+            </w:pPr>
+          </w:p>
+        </w:tc>
+        <w:tc>
+          <w:tcPr>
+            <w:tcW w:w="0" w:type="auto"/>
+          </w:tcPr>
+          <w:p>
+            <w:r>
+              <w:t>Faster sponsor onboarding, improved communication visibility, and reduced coordination delays.</w:t>
+            </w:r>
+          </w:p>
+        </w:tc>
+      </w:tr>
+      <w:tr>
+        <w:tc>
+          <w:tcPr>
+            <w:tcW w:w="0" w:type="auto"/>
+          </w:tcPr>
+          <w:p>
+            <w:r>
+              <w:t>AI Attendee Matchmaking</w:t>
+            </w:r>
+          </w:p>
+        </w:tc>
+        <w:tc>
+          <w:tcPr>
+            <w:tcW w:w="0" w:type="auto"/>
+          </w:tcPr>
+          <w:tbl>
+            <w:tblPr>
+              <w:tblW w:w="0" w:type="auto"/>
+              <w:tblCellSpacing w:w="15" w:type="dxa"/>
+              <w:tblCellMar>
+                <w:top w:w="15" w:type="dxa"/>
+                <w:left w:w="15" w:type="dxa"/>
+                <w:bottom w:w="15" w:type="dxa"/>
+                <w:right w:w="15" w:type="dxa"/>
+              </w:tblCellMar>
+              <w:tblLook w:val="04A0" w:firstRow="1" w:lastRow="0" w:firstColumn="1" w:lastColumn="0" w:noHBand="0" w:noVBand="1"/>
+            </w:tblPr>
+            <w:tblGrid>
+              <w:gridCol w:w="96"/>
+            </w:tblGrid>
+            <w:tr>
+              <w:trPr>
+                <w:tblCellSpacing w:w="15" w:type="dxa"/>
+              </w:trPr>
+              <w:tc>
+                <w:tcPr>
+                  <w:tcW w:w="0" w:type="auto"/>
+                  <w:vAlign w:val="center"/>
+                  <w:hideMark/>
+                </w:tcPr>
+                <w:p>
+                  <w:pPr>
+                    <w:spacing w:after="0" w:line="240" w:lineRule="auto"/>
+                    <w:rPr>
+                      <w:lang w:val="en-GB"/>
+                    </w:rPr>
+                  </w:pPr>
+                </w:p>
+              </w:tc>
+            </w:tr>
+          </w:tbl>
+          <w:p>
+            <w:pPr>
+              <w:rPr>
+                <w:vanish/>
+                <w:lang w:val="en-GB"/>
+              </w:rPr>
+            </w:pPr>
+          </w:p>
+          <w:tbl>
+            <w:tblPr>
+              <w:tblW w:w="0" w:type="auto"/>
+              <w:tblCellSpacing w:w="15" w:type="dxa"/>
+              <w:tblCellMar>
+                <w:top w:w="15" w:type="dxa"/>
+                <w:left w:w="15" w:type="dxa"/>
+                <w:bottom w:w="15" w:type="dxa"/>
+                <w:right w:w="15" w:type="dxa"/>
+              </w:tblCellMar>
+              <w:tblLook w:val="04A0" w:firstRow="1" w:lastRow="0" w:firstColumn="1" w:lastColumn="0" w:noHBand="0" w:noVBand="1"/>
+            </w:tblPr>
+            <w:tblGrid>
+              <w:gridCol w:w="1941"/>
+            </w:tblGrid>
+            <w:tr>
+              <w:trPr>
+                <w:tblCellSpacing w:w="15" w:type="dxa"/>
+              </w:trPr>
+              <w:tc>
+                <w:tcPr>
+                  <w:tcW w:w="0" w:type="auto"/>
+                  <w:vAlign w:val="center"/>
+                  <w:hideMark/>
+                </w:tcPr>
+                <w:p>
+                  <w:pPr>
+                    <w:spacing w:after="0" w:line="240" w:lineRule="auto"/>
+                    <w:rPr>
+                      <w:lang w:val="en-GB"/>
+                    </w:rPr>
+                  </w:pPr>
+                  <w:r>
+                    <w:rPr>
+                      <w:lang w:val="en-GB"/>
+                    </w:rPr>
+                    <w:t>Attendees may struggle to identify relevant networking opportunities during the event.</w:t>
+                  </w:r>
+                </w:p>
+              </w:tc>
+            </w:tr>
+          </w:tbl>
+          <w:p>
+            <w:pPr>
+              <w:rPr>
+                <w:lang w:val="en-GB"/>
+              </w:rPr>
+            </w:pPr>
+          </w:p>
+        </w:tc>
+        <w:tc>
+          <w:tcPr>
+            <w:tcW w:w="0" w:type="auto"/>
+          </w:tcPr>
+          <w:p>
+            <w:r>
+              <w:t>AI analyzes attendee interests, startup focus areas, and networking preferences to recommend relevant connections and networking opportunities.</w:t>
+            </w:r>
+          </w:p>
+        </w:tc>
+        <w:tc>
+          <w:tcPr>
+            <w:tcW w:w="0" w:type="auto"/>
+          </w:tcPr>
+          <w:p>
+            <w:r>
+              <w:t>Improved attendee engagement, networking quality, and ecosystem interaction.</w:t>
+            </w:r>
+          </w:p>
+        </w:tc>
+      </w:tr>
+      <w:tr>
+        <w:tc>
+          <w:tcPr>
+            <w:tcW w:w="0" w:type="auto"/>
+          </w:tcPr>
+          <w:p>
+            <w:r>
+              <w:t>AI Incident Escalation Monitoring</w:t>
+            </w:r>
+          </w:p>
+        </w:tc>
+        <w:tc>
+          <w:tcPr>
+            <w:tcW w:w="0" w:type="auto"/>
+          </w:tcPr>
+          <w:p>
+            <w:r>
+              <w:t>Operational issues may not be identified or prioritized quickly during live event execution.</w:t>
+            </w:r>
+          </w:p>
+        </w:tc>
+        <w:tc>
+          <w:tcPr>
+            <w:tcW w:w="0" w:type="auto"/>
+          </w:tcPr>
+          <w:p>
+            <w:r>
+              <w:t>AI-supported monitoring systems categorize incidents, prioritize operational risks, and notify response teams in real time.</w:t>
+            </w:r>
+          </w:p>
+        </w:tc>
+        <w:tc>
+          <w:tcPr>
+            <w:tcW w:w="0" w:type="auto"/>
+          </w:tcPr>
+          <w:p>
+            <w:r>
+              <w:t>Faster operational response times and improved event stabilization.</w:t>
+            </w:r>
+          </w:p>
+        </w:tc>
+      </w:tr>
+      <w:tr>
+        <w:tc>
+          <w:tcPr>
+            <w:tcW w:w="0" w:type="auto"/>
+          </w:tcPr>
+          <w:p>
+            <w:r>
+              <w:t>AI Hackathon Team Matching</w:t>
+            </w:r>
+          </w:p>
+        </w:tc>
+        <w:tc>
+          <w:tcPr>
+            <w:tcW w:w="0" w:type="auto"/>
+          </w:tcPr>
+          <w:p>
+            <w:r>
+              <w:t>Manual team formation may create unbalanced teams and reduce collaboration efficiency.</w:t>
+            </w:r>
+          </w:p>
+        </w:tc>
+        <w:tc>
+          <w:tcPr>
+            <w:tcW w:w="0" w:type="auto"/>
+          </w:tcPr>
+          <w:p>
+            <w:r>
+              <w:t>AI analyzes participant profiles, technical skills, and interests to recommend balanced hackathon team structures.</w:t>
+            </w:r>
+          </w:p>
+        </w:tc>
+        <w:tc>
+          <w:tcPr>
+            <w:tcW w:w="0" w:type="auto"/>
+          </w:tcPr>
+          <w:p>
+            <w:r>
+              <w:t>Improved collaboration quality, team balance, and hackathon coordination efficiency.</w:t>
+            </w:r>
+          </w:p>
+        </w:tc>
+      </w:tr>
+      <w:tr>
+        <w:tc>
+          <w:tcPr>
+            <w:tcW w:w="0" w:type="auto"/>
+          </w:tcPr>
+          <w:p>
+            <w:r>
+              <w:lastRenderedPageBreak/>
+              <w:t>AI Operational Summary Generation</w:t>
+            </w:r>
+          </w:p>
+        </w:tc>
+        <w:tc>
+          <w:tcPr>
+            <w:tcW w:w="0" w:type="auto"/>
+          </w:tcPr>
+          <w:tbl>
+            <w:tblPr>
+              <w:tblW w:w="0" w:type="auto"/>
+              <w:tblCellSpacing w:w="15" w:type="dxa"/>
+              <w:tblCellMar>
+                <w:top w:w="15" w:type="dxa"/>
+                <w:left w:w="15" w:type="dxa"/>
+                <w:bottom w:w="15" w:type="dxa"/>
+                <w:right w:w="15" w:type="dxa"/>
+              </w:tblCellMar>
+              <w:tblLook w:val="04A0" w:firstRow="1" w:lastRow="0" w:firstColumn="1" w:lastColumn="0" w:noHBand="0" w:noVBand="1"/>
+            </w:tblPr>
+            <w:tblGrid>
+              <w:gridCol w:w="1136"/>
+            </w:tblGrid>
+            <w:tr>
+              <w:trPr>
+                <w:tblCellSpacing w:w="15" w:type="dxa"/>
+              </w:trPr>
+              <w:tc>
+                <w:tcPr>
+                  <w:tcW w:w="0" w:type="auto"/>
+                  <w:vAlign w:val="center"/>
+                  <w:hideMark/>
+                </w:tcPr>
+                <w:p>
+                  <w:pPr>
+                    <w:spacing w:after="0" w:line="240" w:lineRule="auto"/>
+                    <w:rPr>
+                      <w:lang w:val="en-GB"/>
+                    </w:rPr>
+                  </w:pPr>
+                  <w:r>
+                    <w:rPr>
+                      <w:lang w:val="en-GB"/>
+                    </w:rPr>
+                    <w:t>Generation</w:t>
+                  </w:r>
+                </w:p>
+              </w:tc>
+            </w:tr>
+          </w:tbl>
+          <w:p>
+            <w:pPr>
+              <w:rPr>
+                <w:vanish/>
+                <w:lang w:val="en-GB"/>
+              </w:rPr>
+            </w:pPr>
+          </w:p>
+          <w:tbl>
+            <w:tblPr>
+              <w:tblW w:w="0" w:type="auto"/>
+              <w:tblCellSpacing w:w="15" w:type="dxa"/>
+              <w:tblCellMar>
+                <w:top w:w="15" w:type="dxa"/>
+                <w:left w:w="15" w:type="dxa"/>
+                <w:bottom w:w="15" w:type="dxa"/>
+                <w:right w:w="15" w:type="dxa"/>
+              </w:tblCellMar>
+              <w:tblLook w:val="04A0" w:firstRow="1" w:lastRow="0" w:firstColumn="1" w:lastColumn="0" w:noHBand="0" w:noVBand="1"/>
+            </w:tblPr>
+            <w:tblGrid>
+              <w:gridCol w:w="1941"/>
+            </w:tblGrid>
+            <w:tr>
+              <w:trPr>
+                <w:tblCellSpacing w:w="15" w:type="dxa"/>
+              </w:trPr>
+              <w:tc>
+                <w:tcPr>
+                  <w:tcW w:w="0" w:type="auto"/>
+                  <w:vAlign w:val="center"/>
+                  <w:hideMark/>
+                </w:tcPr>
+                <w:p>
+                  <w:pPr>
+                    <w:spacing w:after="0" w:line="240" w:lineRule="auto"/>
+                    <w:rPr>
+                      <w:lang w:val="en-GB"/>
+                    </w:rPr>
+                  </w:pPr>
+                  <w:r>
+                    <w:rPr>
+                      <w:lang w:val="en-GB"/>
+                    </w:rPr>
+                    <w:t>Manual reporting and operational summarization consume significant coordination time after event activities.</w:t>
+                  </w:r>
+                </w:p>
+              </w:tc>
+            </w:tr>
+          </w:tbl>
+          <w:p>
+            <w:pPr>
+              <w:rPr>
+                <w:lang w:val="en-GB"/>
+              </w:rPr>
+            </w:pPr>
+          </w:p>
+        </w:tc>
+        <w:tc>
+          <w:tcPr>
+            <w:tcW w:w="0" w:type="auto"/>
+          </w:tcPr>
+          <w:p>
+            <w:r>
+              <w:t>AI-generated summaries compile dashboard insights, incident logs, operational updates, and event performance metrics automatically.</w:t>
+            </w:r>
+          </w:p>
+        </w:tc>
+        <w:tc>
+          <w:tcPr>
+            <w:tcW w:w="0" w:type="auto"/>
+          </w:tcPr>
+          <w:p>
+            <w:r>
+              <w:t>Faster reporting, improved operational visibility, and more efficient decision-making support.</w:t>
+            </w:r>
+          </w:p>
+        </w:tc>
+      </w:tr>
+    </w:tbl>
+    <w:p/>
     <w:sectPr>
       <w:pgSz w:w="12240" w:h="15840"/>
       <w:pgMar w:top="1440" w:right="1800" w:bottom="1440" w:left="1800" w:header="720" w:footer="720" w:gutter="0"/>

</xml_diff>

<commit_message>
Added risk management and operational stabilization framework
</commit_message>
<xml_diff>
--- a/01_Report/MunichTech_EXPO_Operations_Proposal_Starter.docx
+++ b/01_Report/MunichTech_EXPO_Operations_Proposal_Starter.docx
@@ -1875,6 +1875,1169 @@
         </w:tc>
       </w:tr>
     </w:tbl>
+    <w:p/>
+    <w:p/>
+    <w:p/>
+    <w:p>
+      <w:pPr>
+        <w:pStyle w:val="Heading2"/>
+      </w:pPr>
+      <w:r>
+        <w:t>Operational Workflow Automations</w:t>
+      </w:r>
+    </w:p>
+    <w:tbl>
+      <w:tblPr>
+        <w:tblStyle w:val="TableGrid"/>
+        <w:tblW w:w="5000" w:type="pct"/>
+        <w:tblLook w:val="04A0" w:firstRow="1" w:lastRow="0" w:firstColumn="1" w:lastColumn="0" w:noHBand="0" w:noVBand="1"/>
+      </w:tblPr>
+      <w:tblGrid>
+        <w:gridCol w:w="2157"/>
+        <w:gridCol w:w="2157"/>
+        <w:gridCol w:w="2158"/>
+        <w:gridCol w:w="2158"/>
+      </w:tblGrid>
+      <w:tr>
+        <w:tc>
+          <w:tcPr>
+            <w:tcW w:w="1250" w:type="pct"/>
+          </w:tcPr>
+          <w:p>
+            <w:r>
+              <w:t>Automation</w:t>
+            </w:r>
+          </w:p>
+        </w:tc>
+        <w:tc>
+          <w:tcPr>
+            <w:tcW w:w="1250" w:type="pct"/>
+          </w:tcPr>
+          <w:p>
+            <w:r>
+              <w:t>Problem</w:t>
+            </w:r>
+          </w:p>
+        </w:tc>
+        <w:tc>
+          <w:tcPr>
+            <w:tcW w:w="1250" w:type="pct"/>
+          </w:tcPr>
+          <w:p>
+            <w:r>
+              <w:t>Workflow</w:t>
+            </w:r>
+          </w:p>
+        </w:tc>
+        <w:tc>
+          <w:tcPr>
+            <w:tcW w:w="1250" w:type="pct"/>
+          </w:tcPr>
+          <w:p>
+            <w:r>
+              <w:t>Expected Impact</w:t>
+            </w:r>
+          </w:p>
+        </w:tc>
+      </w:tr>
+      <w:tr>
+        <w:tc>
+          <w:tcPr>
+            <w:tcW w:w="1250" w:type="pct"/>
+          </w:tcPr>
+          <w:p>
+            <w:r>
+              <w:t>Automated Ticket Confirmation System</w:t>
+            </w:r>
+          </w:p>
+        </w:tc>
+        <w:tc>
+          <w:tcPr>
+            <w:tcW w:w="1250" w:type="pct"/>
+          </w:tcPr>
+          <w:p>
+            <w:r>
+              <w:t>Manual attendee confirmations may delay communication and create registration inconsistencies.</w:t>
+            </w:r>
+          </w:p>
+        </w:tc>
+        <w:tc>
+          <w:tcPr>
+            <w:tcW w:w="1250" w:type="pct"/>
+          </w:tcPr>
+          <w:p>
+            <w:r>
+              <w:t>Registration systems automatically send confirmation emails, QR codes, and event instructions after ticket purchases are completed.</w:t>
+            </w:r>
+          </w:p>
+        </w:tc>
+        <w:tc>
+          <w:tcPr>
+            <w:tcW w:w="1250" w:type="pct"/>
+          </w:tcPr>
+          <w:p>
+            <w:r>
+              <w:t>Improved attendee communication speed and reduced registration coordination workload.</w:t>
+            </w:r>
+          </w:p>
+        </w:tc>
+      </w:tr>
+      <w:tr>
+        <w:tc>
+          <w:tcPr>
+            <w:tcW w:w="1250" w:type="pct"/>
+          </w:tcPr>
+          <w:p>
+            <w:r>
+              <w:t>Volunteer Shift Scheduling Automation</w:t>
+            </w:r>
+          </w:p>
+        </w:tc>
+        <w:tc>
+          <w:tcPr>
+            <w:tcW w:w="1250" w:type="pct"/>
+          </w:tcPr>
+          <w:p>
+            <w:r>
+              <w:t>Manual volunteer scheduling may create staffing conflicts and coordination gaps during the event</w:t>
+            </w:r>
+          </w:p>
+        </w:tc>
+        <w:tc>
+          <w:tcPr>
+            <w:tcW w:w="1250" w:type="pct"/>
+          </w:tcPr>
+          <w:p>
+            <w:r>
+              <w:t>Scheduling systems automatically assign volunteer shifts, distribute responsibilities, and send reminder notifications before operational activities begin.</w:t>
+            </w:r>
+          </w:p>
+        </w:tc>
+        <w:tc>
+          <w:tcPr>
+            <w:tcW w:w="1250" w:type="pct"/>
+          </w:tcPr>
+          <w:p>
+            <w:r>
+              <w:t>Improved volunteer coordination and operational staffing efficiency.</w:t>
+            </w:r>
+          </w:p>
+        </w:tc>
+      </w:tr>
+      <w:tr>
+        <w:tc>
+          <w:tcPr>
+            <w:tcW w:w="1250" w:type="pct"/>
+          </w:tcPr>
+          <w:p>
+            <w:r>
+              <w:t>Speaker Session Reminder Automation</w:t>
+            </w:r>
+          </w:p>
+        </w:tc>
+        <w:tc>
+          <w:tcPr>
+            <w:tcW w:w="1250" w:type="pct"/>
+          </w:tcPr>
+          <w:p>
+            <w:r>
+              <w:t>Speaker presentation submissions and confirmations may be delayed without structured follow-up systems.</w:t>
+            </w:r>
+          </w:p>
+        </w:tc>
+        <w:tc>
+          <w:tcPr>
+            <w:tcW w:w="1250" w:type="pct"/>
+          </w:tcPr>
+          <w:p>
+            <w:r>
+              <w:t>Automated reminders notify speakers regarding session confirmations, presentation uploads, and event schedules before the event.</w:t>
+            </w:r>
+          </w:p>
+        </w:tc>
+        <w:tc>
+          <w:tcPr>
+            <w:tcW w:w="1250" w:type="pct"/>
+          </w:tcPr>
+          <w:p>
+            <w:r>
+              <w:t>Reduced speaker coordination risks and improved session readiness visibility.</w:t>
+            </w:r>
+          </w:p>
+        </w:tc>
+      </w:tr>
+      <w:tr>
+        <w:tc>
+          <w:tcPr>
+            <w:tcW w:w="1250" w:type="pct"/>
+          </w:tcPr>
+          <w:p>
+            <w:r>
+              <w:t>Sponsor Reporting Automation</w:t>
+            </w:r>
+          </w:p>
+        </w:tc>
+        <w:tc>
+          <w:tcPr>
+            <w:tcW w:w="1250" w:type="pct"/>
+          </w:tcPr>
+          <w:p>
+            <w:r>
+              <w:t>Manual sponsor performance reporting after the event may consume significant operational time.</w:t>
+            </w:r>
+          </w:p>
+        </w:tc>
+        <w:tc>
+          <w:tcPr>
+            <w:tcW w:w="1250" w:type="pct"/>
+          </w:tcPr>
+          <w:p>
+            <w:r>
+              <w:t xml:space="preserve">Operational systems automatically generate sponsor engagement reports using attendance metrics, networking </w:t>
+            </w:r>
+            <w:r>
+              <w:lastRenderedPageBreak/>
+              <w:t>activity, and booth interaction data.</w:t>
+            </w:r>
+          </w:p>
+        </w:tc>
+        <w:tc>
+          <w:tcPr>
+            <w:tcW w:w="1250" w:type="pct"/>
+          </w:tcPr>
+          <w:p/>
+        </w:tc>
+      </w:tr>
+      <w:tr>
+        <w:tc>
+          <w:tcPr>
+            <w:tcW w:w="1250" w:type="pct"/>
+          </w:tcPr>
+          <w:p>
+            <w:r>
+              <w:t>Operational Deadline Monitoring System</w:t>
+            </w:r>
+          </w:p>
+        </w:tc>
+        <w:tc>
+          <w:tcPr>
+            <w:tcW w:w="1250" w:type="pct"/>
+          </w:tcPr>
+          <w:p>
+            <w:r>
+              <w:t>Important operational deadlines may be missed across multiple event coordination activities.</w:t>
+            </w:r>
+          </w:p>
+        </w:tc>
+        <w:tc>
+          <w:tcPr>
+            <w:tcW w:w="1250" w:type="pct"/>
+          </w:tcPr>
+          <w:p>
+            <w:r>
+              <w:t>Monitoring systems track operational milestones and automatically notify coordination teams about upcoming deadlines and pending tasks.</w:t>
+            </w:r>
+          </w:p>
+        </w:tc>
+        <w:tc>
+          <w:tcPr>
+            <w:tcW w:w="1250" w:type="pct"/>
+          </w:tcPr>
+          <w:p>
+            <w:r>
+              <w:t>Improved operational execution consistency and reduced coordination delays.</w:t>
+            </w:r>
+          </w:p>
+        </w:tc>
+      </w:tr>
+    </w:tbl>
+    <w:p/>
+    <w:p/>
+    <w:p>
+      <w:pPr>
+        <w:pStyle w:val="Heading1"/>
+      </w:pPr>
+      <w:r>
+        <w:t>Risk Management &amp; Operational Stabilization</w:t>
+      </w:r>
+    </w:p>
+    <w:p>
+      <w:r>
+        <w:t xml:space="preserve">Effective event operations require proactive risk identification, escalation planning, and operational stabilization strategies. The </w:t>
+      </w:r>
+      <w:proofErr w:type="spellStart"/>
+      <w:r>
+        <w:t>MunichTech</w:t>
+      </w:r>
+      <w:proofErr w:type="spellEnd"/>
+      <w:r>
+        <w:t xml:space="preserve"> EXPO 2026 operational framework integrates structured risk management processes to reduce operational disruptions, improve response coordination, and support scalable event execution across multiple operational areas.</w:t>
+      </w:r>
+    </w:p>
+    <w:p>
+      <w:pPr>
+        <w:pStyle w:val="Heading2"/>
+      </w:pPr>
+      <w:r>
+        <w:t>Operational Risk Management Table</w:t>
+      </w:r>
+    </w:p>
+    <w:tbl>
+      <w:tblPr>
+        <w:tblStyle w:val="TableGrid"/>
+        <w:tblW w:w="0" w:type="auto"/>
+        <w:tblLook w:val="04A0" w:firstRow="1" w:lastRow="0" w:firstColumn="1" w:lastColumn="0" w:noHBand="0" w:noVBand="1"/>
+      </w:tblPr>
+      <w:tblGrid>
+        <w:gridCol w:w="2624"/>
+        <w:gridCol w:w="1304"/>
+        <w:gridCol w:w="991"/>
+        <w:gridCol w:w="3711"/>
+      </w:tblGrid>
+      <w:tr>
+        <w:tc>
+          <w:tcPr>
+            <w:tcW w:w="0" w:type="auto"/>
+          </w:tcPr>
+          <w:p>
+            <w:pPr>
+              <w:rPr>
+                <w:b/>
+                <w:bCs/>
+              </w:rPr>
+            </w:pPr>
+            <w:r>
+              <w:rPr>
+                <w:b/>
+                <w:bCs/>
+              </w:rPr>
+              <w:t>Operational Risk</w:t>
+            </w:r>
+          </w:p>
+        </w:tc>
+        <w:tc>
+          <w:tcPr>
+            <w:tcW w:w="0" w:type="auto"/>
+          </w:tcPr>
+          <w:p>
+            <w:pPr>
+              <w:rPr>
+                <w:b/>
+                <w:bCs/>
+              </w:rPr>
+            </w:pPr>
+            <w:r>
+              <w:rPr>
+                <w:b/>
+                <w:bCs/>
+              </w:rPr>
+              <w:t>Likelihood</w:t>
+            </w:r>
+          </w:p>
+        </w:tc>
+        <w:tc>
+          <w:tcPr>
+            <w:tcW w:w="0" w:type="auto"/>
+          </w:tcPr>
+          <w:p>
+            <w:pPr>
+              <w:rPr>
+                <w:b/>
+                <w:bCs/>
+              </w:rPr>
+            </w:pPr>
+            <w:r>
+              <w:rPr>
+                <w:b/>
+                <w:bCs/>
+              </w:rPr>
+              <w:t>Impact</w:t>
+            </w:r>
+          </w:p>
+        </w:tc>
+        <w:tc>
+          <w:tcPr>
+            <w:tcW w:w="0" w:type="auto"/>
+          </w:tcPr>
+          <w:p>
+            <w:pPr>
+              <w:rPr>
+                <w:b/>
+                <w:bCs/>
+              </w:rPr>
+            </w:pPr>
+            <w:r>
+              <w:rPr>
+                <w:b/>
+                <w:bCs/>
+              </w:rPr>
+              <w:t>Mitigation Strategy</w:t>
+            </w:r>
+          </w:p>
+        </w:tc>
+      </w:tr>
+      <w:tr>
+        <w:tc>
+          <w:tcPr>
+            <w:tcW w:w="0" w:type="auto"/>
+          </w:tcPr>
+          <w:p>
+            <w:r>
+              <w:t>Speaker Cancellation</w:t>
+            </w:r>
+          </w:p>
+        </w:tc>
+        <w:tc>
+          <w:tcPr>
+            <w:tcW w:w="0" w:type="auto"/>
+          </w:tcPr>
+          <w:p>
+            <w:pPr>
+              <w:jc w:val="center"/>
+            </w:pPr>
+            <w:r>
+              <w:t>Medium</w:t>
+            </w:r>
+          </w:p>
+        </w:tc>
+        <w:tc>
+          <w:tcPr>
+            <w:tcW w:w="0" w:type="auto"/>
+          </w:tcPr>
+          <w:p>
+            <w:pPr>
+              <w:jc w:val="center"/>
+            </w:pPr>
+            <w:r>
+              <w:t>High</w:t>
+            </w:r>
+          </w:p>
+        </w:tc>
+        <w:tc>
+          <w:tcPr>
+            <w:tcW w:w="0" w:type="auto"/>
+          </w:tcPr>
+          <w:p>
+            <w:r>
+              <w:t>Maintain backup speakers and flexible session scheduling</w:t>
+            </w:r>
+          </w:p>
+        </w:tc>
+      </w:tr>
+      <w:tr>
+        <w:tc>
+          <w:tcPr>
+            <w:tcW w:w="0" w:type="auto"/>
+          </w:tcPr>
+          <w:p>
+            <w:r>
+              <w:t>Volunteer Coordination Breakdown</w:t>
+            </w:r>
+          </w:p>
+        </w:tc>
+        <w:tc>
+          <w:tcPr>
+            <w:tcW w:w="0" w:type="auto"/>
+          </w:tcPr>
+          <w:p>
+            <w:pPr>
+              <w:jc w:val="center"/>
+            </w:pPr>
+            <w:r>
+              <w:t>Medium</w:t>
+            </w:r>
+          </w:p>
+        </w:tc>
+        <w:tc>
+          <w:tcPr>
+            <w:tcW w:w="0" w:type="auto"/>
+          </w:tcPr>
+          <w:p>
+            <w:pPr>
+              <w:jc w:val="center"/>
+            </w:pPr>
+            <w:r>
+              <w:t>High</w:t>
+            </w:r>
+          </w:p>
+        </w:tc>
+        <w:tc>
+          <w:tcPr>
+            <w:tcW w:w="0" w:type="auto"/>
+          </w:tcPr>
+          <w:p>
+            <w:r>
+              <w:t>Implement automated scheduling and backup staffing plans</w:t>
+            </w:r>
+          </w:p>
+        </w:tc>
+      </w:tr>
+      <w:tr>
+        <w:tc>
+          <w:tcPr>
+            <w:tcW w:w="0" w:type="auto"/>
+          </w:tcPr>
+          <w:p>
+            <w:r>
+              <w:t>Registration Spike Overload</w:t>
+            </w:r>
+          </w:p>
+        </w:tc>
+        <w:tc>
+          <w:tcPr>
+            <w:tcW w:w="0" w:type="auto"/>
+          </w:tcPr>
+          <w:p>
+            <w:pPr>
+              <w:jc w:val="center"/>
+            </w:pPr>
+            <w:r>
+              <w:t>High</w:t>
+            </w:r>
+          </w:p>
+        </w:tc>
+        <w:tc>
+          <w:tcPr>
+            <w:tcW w:w="0" w:type="auto"/>
+          </w:tcPr>
+          <w:p>
+            <w:pPr>
+              <w:jc w:val="center"/>
+            </w:pPr>
+            <w:r>
+              <w:t>High</w:t>
+            </w:r>
+          </w:p>
+        </w:tc>
+        <w:tc>
+          <w:tcPr>
+            <w:tcW w:w="0" w:type="auto"/>
+          </w:tcPr>
+          <w:p>
+            <w:r>
+              <w:t>Monitor attendee capacity and scale check-in resources dynamically</w:t>
+            </w:r>
+          </w:p>
+        </w:tc>
+      </w:tr>
+      <w:tr>
+        <w:tc>
+          <w:tcPr>
+            <w:tcW w:w="0" w:type="auto"/>
+          </w:tcPr>
+          <w:p>
+            <w:r>
+              <w:t>Sponsor Branding Delays</w:t>
+            </w:r>
+          </w:p>
+        </w:tc>
+        <w:tc>
+          <w:tcPr>
+            <w:tcW w:w="0" w:type="auto"/>
+          </w:tcPr>
+          <w:p>
+            <w:pPr>
+              <w:jc w:val="center"/>
+            </w:pPr>
+            <w:r>
+              <w:t>Medium</w:t>
+            </w:r>
+          </w:p>
+        </w:tc>
+        <w:tc>
+          <w:tcPr>
+            <w:tcW w:w="0" w:type="auto"/>
+          </w:tcPr>
+          <w:p>
+            <w:pPr>
+              <w:jc w:val="center"/>
+            </w:pPr>
+            <w:r>
+              <w:t>Medium</w:t>
+            </w:r>
+          </w:p>
+        </w:tc>
+        <w:tc>
+          <w:tcPr>
+            <w:tcW w:w="0" w:type="auto"/>
+          </w:tcPr>
+          <w:p>
+            <w:r>
+              <w:t>Use automated reminders and pre-event branding deadlines.</w:t>
+            </w:r>
+          </w:p>
+        </w:tc>
+      </w:tr>
+      <w:tr>
+        <w:tc>
+          <w:tcPr>
+            <w:tcW w:w="0" w:type="auto"/>
+          </w:tcPr>
+          <w:p>
+            <w:r>
+              <w:t>Internet or Network Failure</w:t>
+            </w:r>
+          </w:p>
+        </w:tc>
+        <w:tc>
+          <w:tcPr>
+            <w:tcW w:w="0" w:type="auto"/>
+          </w:tcPr>
+          <w:tbl>
+            <w:tblPr>
+              <w:tblW w:w="0" w:type="auto"/>
+              <w:tblCellSpacing w:w="15" w:type="dxa"/>
+              <w:tblCellMar>
+                <w:top w:w="15" w:type="dxa"/>
+                <w:left w:w="15" w:type="dxa"/>
+                <w:bottom w:w="15" w:type="dxa"/>
+                <w:right w:w="15" w:type="dxa"/>
+              </w:tblCellMar>
+              <w:tblLook w:val="04A0" w:firstRow="1" w:lastRow="0" w:firstColumn="1" w:lastColumn="0" w:noHBand="0" w:noVBand="1"/>
+            </w:tblPr>
+            <w:tblGrid>
+              <w:gridCol w:w="96"/>
+            </w:tblGrid>
+            <w:tr>
+              <w:trPr>
+                <w:tblCellSpacing w:w="15" w:type="dxa"/>
+              </w:trPr>
+              <w:tc>
+                <w:tcPr>
+                  <w:tcW w:w="0" w:type="auto"/>
+                  <w:vAlign w:val="center"/>
+                  <w:hideMark/>
+                </w:tcPr>
+                <w:p>
+                  <w:pPr>
+                    <w:spacing w:after="0" w:line="240" w:lineRule="auto"/>
+                    <w:jc w:val="center"/>
+                    <w:rPr>
+                      <w:lang w:val="en-GB"/>
+                    </w:rPr>
+                  </w:pPr>
+                </w:p>
+              </w:tc>
+            </w:tr>
+          </w:tbl>
+          <w:p>
+            <w:pPr>
+              <w:jc w:val="center"/>
+              <w:rPr>
+                <w:vanish/>
+                <w:lang w:val="en-GB"/>
+              </w:rPr>
+            </w:pPr>
+          </w:p>
+          <w:tbl>
+            <w:tblPr>
+              <w:tblW w:w="0" w:type="auto"/>
+              <w:tblCellSpacing w:w="15" w:type="dxa"/>
+              <w:tblCellMar>
+                <w:top w:w="15" w:type="dxa"/>
+                <w:left w:w="15" w:type="dxa"/>
+                <w:bottom w:w="15" w:type="dxa"/>
+                <w:right w:w="15" w:type="dxa"/>
+              </w:tblCellMar>
+              <w:tblLook w:val="04A0" w:firstRow="1" w:lastRow="0" w:firstColumn="1" w:lastColumn="0" w:noHBand="0" w:noVBand="1"/>
+            </w:tblPr>
+            <w:tblGrid>
+              <w:gridCol w:w="865"/>
+            </w:tblGrid>
+            <w:tr>
+              <w:trPr>
+                <w:tblCellSpacing w:w="15" w:type="dxa"/>
+              </w:trPr>
+              <w:tc>
+                <w:tcPr>
+                  <w:tcW w:w="0" w:type="auto"/>
+                  <w:vAlign w:val="center"/>
+                  <w:hideMark/>
+                </w:tcPr>
+                <w:p>
+                  <w:pPr>
+                    <w:spacing w:after="0" w:line="240" w:lineRule="auto"/>
+                    <w:jc w:val="center"/>
+                    <w:rPr>
+                      <w:lang w:val="en-GB"/>
+                    </w:rPr>
+                  </w:pPr>
+                  <w:r>
+                    <w:rPr>
+                      <w:lang w:val="en-GB"/>
+                    </w:rPr>
+                    <w:t>Medium</w:t>
+                  </w:r>
+                </w:p>
+              </w:tc>
+            </w:tr>
+          </w:tbl>
+          <w:p>
+            <w:pPr>
+              <w:jc w:val="center"/>
+            </w:pPr>
+          </w:p>
+        </w:tc>
+        <w:tc>
+          <w:tcPr>
+            <w:tcW w:w="0" w:type="auto"/>
+          </w:tcPr>
+          <w:tbl>
+            <w:tblPr>
+              <w:tblW w:w="0" w:type="auto"/>
+              <w:tblCellSpacing w:w="15" w:type="dxa"/>
+              <w:tblCellMar>
+                <w:top w:w="15" w:type="dxa"/>
+                <w:left w:w="15" w:type="dxa"/>
+                <w:bottom w:w="15" w:type="dxa"/>
+                <w:right w:w="15" w:type="dxa"/>
+              </w:tblCellMar>
+              <w:tblLook w:val="04A0" w:firstRow="1" w:lastRow="0" w:firstColumn="1" w:lastColumn="0" w:noHBand="0" w:noVBand="1"/>
+            </w:tblPr>
+            <w:tblGrid>
+              <w:gridCol w:w="96"/>
+            </w:tblGrid>
+            <w:tr>
+              <w:trPr>
+                <w:tblCellSpacing w:w="15" w:type="dxa"/>
+              </w:trPr>
+              <w:tc>
+                <w:tcPr>
+                  <w:tcW w:w="0" w:type="auto"/>
+                  <w:vAlign w:val="center"/>
+                  <w:hideMark/>
+                </w:tcPr>
+                <w:p>
+                  <w:pPr>
+                    <w:spacing w:after="0" w:line="240" w:lineRule="auto"/>
+                    <w:jc w:val="center"/>
+                    <w:rPr>
+                      <w:lang w:val="en-GB"/>
+                    </w:rPr>
+                  </w:pPr>
+                </w:p>
+              </w:tc>
+            </w:tr>
+          </w:tbl>
+          <w:p>
+            <w:pPr>
+              <w:jc w:val="center"/>
+              <w:rPr>
+                <w:vanish/>
+                <w:lang w:val="en-GB"/>
+              </w:rPr>
+            </w:pPr>
+          </w:p>
+          <w:tbl>
+            <w:tblPr>
+              <w:tblW w:w="0" w:type="auto"/>
+              <w:tblCellSpacing w:w="15" w:type="dxa"/>
+              <w:tblCellMar>
+                <w:top w:w="15" w:type="dxa"/>
+                <w:left w:w="15" w:type="dxa"/>
+                <w:bottom w:w="15" w:type="dxa"/>
+                <w:right w:w="15" w:type="dxa"/>
+              </w:tblCellMar>
+              <w:tblLook w:val="04A0" w:firstRow="1" w:lastRow="0" w:firstColumn="1" w:lastColumn="0" w:noHBand="0" w:noVBand="1"/>
+            </w:tblPr>
+            <w:tblGrid>
+              <w:gridCol w:w="533"/>
+            </w:tblGrid>
+            <w:tr>
+              <w:trPr>
+                <w:tblCellSpacing w:w="15" w:type="dxa"/>
+              </w:trPr>
+              <w:tc>
+                <w:tcPr>
+                  <w:tcW w:w="0" w:type="auto"/>
+                  <w:vAlign w:val="center"/>
+                  <w:hideMark/>
+                </w:tcPr>
+                <w:p>
+                  <w:pPr>
+                    <w:spacing w:after="0" w:line="240" w:lineRule="auto"/>
+                    <w:jc w:val="center"/>
+                    <w:rPr>
+                      <w:lang w:val="en-GB"/>
+                    </w:rPr>
+                  </w:pPr>
+                  <w:r>
+                    <w:rPr>
+                      <w:lang w:val="en-GB"/>
+                    </w:rPr>
+                    <w:t>High</w:t>
+                  </w:r>
+                </w:p>
+              </w:tc>
+            </w:tr>
+          </w:tbl>
+          <w:p>
+            <w:pPr>
+              <w:jc w:val="center"/>
+            </w:pPr>
+          </w:p>
+        </w:tc>
+        <w:tc>
+          <w:tcPr>
+            <w:tcW w:w="0" w:type="auto"/>
+          </w:tcPr>
+          <w:p>
+            <w:r>
+              <w:t>Prepare backup internet connections and technical support teams.</w:t>
+            </w:r>
+          </w:p>
+        </w:tc>
+      </w:tr>
+      <w:tr>
+        <w:tc>
+          <w:tcPr>
+            <w:tcW w:w="0" w:type="auto"/>
+          </w:tcPr>
+          <w:p>
+            <w:r>
+              <w:t>Venue Setup Delays</w:t>
+            </w:r>
+          </w:p>
+        </w:tc>
+        <w:tc>
+          <w:tcPr>
+            <w:tcW w:w="0" w:type="auto"/>
+          </w:tcPr>
+          <w:p>
+            <w:pPr>
+              <w:jc w:val="center"/>
+            </w:pPr>
+            <w:r>
+              <w:t>Low</w:t>
+            </w:r>
+          </w:p>
+        </w:tc>
+        <w:tc>
+          <w:tcPr>
+            <w:tcW w:w="0" w:type="auto"/>
+          </w:tcPr>
+          <w:p>
+            <w:pPr>
+              <w:jc w:val="center"/>
+            </w:pPr>
+            <w:r>
+              <w:t>High</w:t>
+            </w:r>
+          </w:p>
+        </w:tc>
+        <w:tc>
+          <w:tcPr>
+            <w:tcW w:w="0" w:type="auto"/>
+          </w:tcPr>
+          <w:p>
+            <w:r>
+              <w:t>Conduct pre-event operational inspections and setup checkpoints.</w:t>
+            </w:r>
+          </w:p>
+        </w:tc>
+      </w:tr>
+      <w:tr>
+        <w:tc>
+          <w:tcPr>
+            <w:tcW w:w="0" w:type="auto"/>
+          </w:tcPr>
+          <w:p>
+            <w:r>
+              <w:t>Hackathon Submission Issues</w:t>
+            </w:r>
+          </w:p>
+        </w:tc>
+        <w:tc>
+          <w:tcPr>
+            <w:tcW w:w="0" w:type="auto"/>
+          </w:tcPr>
+          <w:p>
+            <w:pPr>
+              <w:jc w:val="center"/>
+            </w:pPr>
+            <w:r>
+              <w:t>Medium</w:t>
+            </w:r>
+          </w:p>
+        </w:tc>
+        <w:tc>
+          <w:tcPr>
+            <w:tcW w:w="0" w:type="auto"/>
+          </w:tcPr>
+          <w:p>
+            <w:pPr>
+              <w:jc w:val="center"/>
+            </w:pPr>
+            <w:r>
+              <w:t>Medium</w:t>
+            </w:r>
+          </w:p>
+        </w:tc>
+        <w:tc>
+          <w:tcPr>
+            <w:tcW w:w="0" w:type="auto"/>
+          </w:tcPr>
+          <w:p>
+            <w:r>
+              <w:t>Implement automated submission validation and technical support.</w:t>
+            </w:r>
+          </w:p>
+        </w:tc>
+      </w:tr>
+      <w:tr>
+        <w:tc>
+          <w:tcPr>
+            <w:tcW w:w="0" w:type="auto"/>
+          </w:tcPr>
+          <w:p>
+            <w:r>
+              <w:t>Communication Delays Between Teams</w:t>
+            </w:r>
+          </w:p>
+        </w:tc>
+        <w:tc>
+          <w:tcPr>
+            <w:tcW w:w="0" w:type="auto"/>
+          </w:tcPr>
+          <w:p>
+            <w:pPr>
+              <w:jc w:val="center"/>
+            </w:pPr>
+            <w:r>
+              <w:t>Medium</w:t>
+            </w:r>
+          </w:p>
+        </w:tc>
+        <w:tc>
+          <w:tcPr>
+            <w:tcW w:w="0" w:type="auto"/>
+          </w:tcPr>
+          <w:tbl>
+            <w:tblPr>
+              <w:tblW w:w="0" w:type="auto"/>
+              <w:tblCellSpacing w:w="15" w:type="dxa"/>
+              <w:tblCellMar>
+                <w:top w:w="15" w:type="dxa"/>
+                <w:left w:w="15" w:type="dxa"/>
+                <w:bottom w:w="15" w:type="dxa"/>
+                <w:right w:w="15" w:type="dxa"/>
+              </w:tblCellMar>
+              <w:tblLook w:val="04A0" w:firstRow="1" w:lastRow="0" w:firstColumn="1" w:lastColumn="0" w:noHBand="0" w:noVBand="1"/>
+            </w:tblPr>
+            <w:tblGrid>
+              <w:gridCol w:w="96"/>
+            </w:tblGrid>
+            <w:tr>
+              <w:trPr>
+                <w:tblCellSpacing w:w="15" w:type="dxa"/>
+              </w:trPr>
+              <w:tc>
+                <w:tcPr>
+                  <w:tcW w:w="0" w:type="auto"/>
+                  <w:vAlign w:val="center"/>
+                  <w:hideMark/>
+                </w:tcPr>
+                <w:p>
+                  <w:pPr>
+                    <w:spacing w:after="0" w:line="240" w:lineRule="auto"/>
+                    <w:jc w:val="center"/>
+                    <w:rPr>
+                      <w:lang w:val="en-GB"/>
+                    </w:rPr>
+                  </w:pPr>
+                </w:p>
+              </w:tc>
+            </w:tr>
+          </w:tbl>
+          <w:p>
+            <w:pPr>
+              <w:jc w:val="center"/>
+              <w:rPr>
+                <w:vanish/>
+                <w:lang w:val="en-GB"/>
+              </w:rPr>
+            </w:pPr>
+          </w:p>
+          <w:tbl>
+            <w:tblPr>
+              <w:tblW w:w="0" w:type="auto"/>
+              <w:tblCellSpacing w:w="15" w:type="dxa"/>
+              <w:tblCellMar>
+                <w:top w:w="15" w:type="dxa"/>
+                <w:left w:w="15" w:type="dxa"/>
+                <w:bottom w:w="15" w:type="dxa"/>
+                <w:right w:w="15" w:type="dxa"/>
+              </w:tblCellMar>
+              <w:tblLook w:val="04A0" w:firstRow="1" w:lastRow="0" w:firstColumn="1" w:lastColumn="0" w:noHBand="0" w:noVBand="1"/>
+            </w:tblPr>
+            <w:tblGrid>
+              <w:gridCol w:w="533"/>
+            </w:tblGrid>
+            <w:tr>
+              <w:trPr>
+                <w:tblCellSpacing w:w="15" w:type="dxa"/>
+              </w:trPr>
+              <w:tc>
+                <w:tcPr>
+                  <w:tcW w:w="0" w:type="auto"/>
+                  <w:vAlign w:val="center"/>
+                  <w:hideMark/>
+                </w:tcPr>
+                <w:p>
+                  <w:pPr>
+                    <w:spacing w:after="0" w:line="240" w:lineRule="auto"/>
+                    <w:jc w:val="center"/>
+                    <w:rPr>
+                      <w:lang w:val="en-GB"/>
+                    </w:rPr>
+                  </w:pPr>
+                  <w:r>
+                    <w:rPr>
+                      <w:lang w:val="en-GB"/>
+                    </w:rPr>
+                    <w:t>High</w:t>
+                  </w:r>
+                </w:p>
+              </w:tc>
+            </w:tr>
+          </w:tbl>
+          <w:p>
+            <w:pPr>
+              <w:jc w:val="center"/>
+            </w:pPr>
+          </w:p>
+        </w:tc>
+        <w:tc>
+          <w:tcPr>
+            <w:tcW w:w="0" w:type="auto"/>
+          </w:tcPr>
+          <w:p>
+            <w:r>
+              <w:t>Use centralized communication platforms and escalation channels.</w:t>
+            </w:r>
+          </w:p>
+        </w:tc>
+      </w:tr>
+      <w:tr>
+        <w:tc>
+          <w:tcPr>
+            <w:tcW w:w="0" w:type="auto"/>
+          </w:tcPr>
+          <w:p>
+            <w:r>
+              <w:t>Technical Equipment Failure</w:t>
+            </w:r>
+          </w:p>
+        </w:tc>
+        <w:tc>
+          <w:tcPr>
+            <w:tcW w:w="0" w:type="auto"/>
+          </w:tcPr>
+          <w:p>
+            <w:pPr>
+              <w:jc w:val="center"/>
+            </w:pPr>
+            <w:r>
+              <w:t>Medium</w:t>
+            </w:r>
+          </w:p>
+        </w:tc>
+        <w:tc>
+          <w:tcPr>
+            <w:tcW w:w="0" w:type="auto"/>
+          </w:tcPr>
+          <w:p>
+            <w:pPr>
+              <w:jc w:val="center"/>
+            </w:pPr>
+            <w:r>
+              <w:t>High</w:t>
+            </w:r>
+          </w:p>
+        </w:tc>
+        <w:tc>
+          <w:tcPr>
+            <w:tcW w:w="0" w:type="auto"/>
+          </w:tcPr>
+          <w:p>
+            <w:r>
+              <w:t>Maintain backup equipment and rapid technical response teams.</w:t>
+            </w:r>
+          </w:p>
+        </w:tc>
+      </w:tr>
+      <w:tr>
+        <w:tc>
+          <w:tcPr>
+            <w:tcW w:w="0" w:type="auto"/>
+          </w:tcPr>
+          <w:p>
+            <w:r>
+              <w:t>Attendee Overcrowding</w:t>
+            </w:r>
+          </w:p>
+        </w:tc>
+        <w:tc>
+          <w:tcPr>
+            <w:tcW w:w="0" w:type="auto"/>
+          </w:tcPr>
+          <w:p>
+            <w:pPr>
+              <w:jc w:val="center"/>
+            </w:pPr>
+            <w:r>
+              <w:t>Medium</w:t>
+            </w:r>
+          </w:p>
+        </w:tc>
+        <w:tc>
+          <w:tcPr>
+            <w:tcW w:w="0" w:type="auto"/>
+          </w:tcPr>
+          <w:p>
+            <w:pPr>
+              <w:jc w:val="center"/>
+            </w:pPr>
+            <w:r>
+              <w:t>High</w:t>
+            </w:r>
+          </w:p>
+        </w:tc>
+        <w:tc>
+          <w:tcPr>
+            <w:tcW w:w="0" w:type="auto"/>
+          </w:tcPr>
+          <w:p>
+            <w:r>
+              <w:t>Monitor attendee flow and manage venue access dynamically.</w:t>
+            </w:r>
+          </w:p>
+        </w:tc>
+      </w:tr>
+    </w:tbl>
+    <w:p/>
+    <w:p>
+      <w:pPr>
+        <w:pStyle w:val="Heading2"/>
+      </w:pPr>
+      <w:r>
+        <w:lastRenderedPageBreak/>
+        <w:t>Operational Stabilization Approach</w:t>
+      </w:r>
+    </w:p>
+    <w:p>
+      <w:r>
+        <w:t xml:space="preserve">The </w:t>
+      </w:r>
+      <w:proofErr w:type="spellStart"/>
+      <w:r>
+        <w:t>MunichTech</w:t>
+      </w:r>
+      <w:proofErr w:type="spellEnd"/>
+      <w:r>
+        <w:t xml:space="preserve"> EXPO 2026 operational framework integrates escalation monitoring, centralized communication systems, AI-supported risk alerts, and rapid response coordination processes to stabilize operational activities during high-pressure event scenarios. Structured escalation workflows and operational monitoring systems improve visibility, reduce response delays, and support continuity across attendee, sponsor, speaker, and hackathon operations.</w:t>
+      </w:r>
+    </w:p>
     <w:p/>
     <w:sectPr>
       <w:pgSz w:w="12240" w:h="15840"/>

</xml_diff>

<commit_message>
Added communication and coordination strategy section
</commit_message>
<xml_diff>
--- a/01_Report/MunichTech_EXPO_Operations_Proposal_Starter.docx
+++ b/01_Report/MunichTech_EXPO_Operations_Proposal_Starter.docx
@@ -3037,6 +3037,656 @@
       <w:r>
         <w:t xml:space="preserve"> EXPO 2026 operational framework integrates escalation monitoring, centralized communication systems, AI-supported risk alerts, and rapid response coordination processes to stabilize operational activities during high-pressure event scenarios. Structured escalation workflows and operational monitoring systems improve visibility, reduce response delays, and support continuity across attendee, sponsor, speaker, and hackathon operations.</w:t>
       </w:r>
+    </w:p>
+    <w:p/>
+    <w:p>
+      <w:pPr>
+        <w:pStyle w:val="Heading1"/>
+      </w:pPr>
+      <w:r>
+        <w:t>Communication &amp; Coordination Strategy</w:t>
+      </w:r>
+    </w:p>
+    <w:p>
+      <w:r>
+        <w:t xml:space="preserve">Effective communication and coordination processes are essential for maintaining operational alignment during large-scale event execution. The </w:t>
+      </w:r>
+      <w:proofErr w:type="spellStart"/>
+      <w:r>
+        <w:t>MunichTech</w:t>
+      </w:r>
+      <w:proofErr w:type="spellEnd"/>
+      <w:r>
+        <w:t xml:space="preserve"> EXPO 2026 operational framework integrates structured communication channels, stakeholder coordination processes, and AI-supported communication systems to improve responsiveness, visibility, and execution consistency across operational teams, sponsors, exhibitors, speakers, volunteers, and attendees.</w:t>
+      </w:r>
+    </w:p>
+    <w:p>
+      <w:pPr>
+        <w:pStyle w:val="Heading2"/>
+      </w:pPr>
+      <w:r>
+        <w:t>Sponsor Communication</w:t>
+      </w:r>
+    </w:p>
+    <w:p>
+      <w:r>
+        <w:t>Sponsor communication processes focus on maintaining consistent operational visibility, onboarding coordination, branding alignment, and post-event reporting activities. Automated reminders, centralized communication tracking, and AI-supported reporting systems help improve sponsor coordination efficiency and reduce communication delays during event preparation and execution phases.</w:t>
+      </w:r>
+    </w:p>
+    <w:p>
+      <w:pPr>
+        <w:pStyle w:val="Heading3"/>
+      </w:pPr>
+      <w:r>
+        <w:t>Example Sponsor Follow-Up Email</w:t>
+      </w:r>
+    </w:p>
+    <w:p>
+      <w:pPr>
+        <w:rPr>
+          <w:lang w:val="en-GB"/>
+        </w:rPr>
+      </w:pPr>
+      <w:r>
+        <w:rPr>
+          <w:b/>
+          <w:bCs/>
+          <w:lang w:val="en-GB"/>
+        </w:rPr>
+        <w:t>Subject:</w:t>
+      </w:r>
+      <w:r>
+        <w:rPr>
+          <w:lang w:val="en-GB"/>
+        </w:rPr>
+        <w:t xml:space="preserve"> </w:t>
+      </w:r>
+      <w:proofErr w:type="spellStart"/>
+      <w:r>
+        <w:rPr>
+          <w:lang w:val="en-GB"/>
+        </w:rPr>
+        <w:t>MunichTech</w:t>
+      </w:r>
+      <w:proofErr w:type="spellEnd"/>
+      <w:r>
+        <w:rPr>
+          <w:lang w:val="en-GB"/>
+        </w:rPr>
+        <w:t xml:space="preserve"> EXPO 2026 – Sponsor Coordination Follow-Up</w:t>
+      </w:r>
+    </w:p>
+    <w:p>
+      <w:pPr>
+        <w:rPr>
+          <w:i/>
+          <w:iCs/>
+          <w:lang w:val="en-GB"/>
+        </w:rPr>
+      </w:pPr>
+      <w:r>
+        <w:rPr>
+          <w:i/>
+          <w:iCs/>
+          <w:lang w:val="en-GB"/>
+        </w:rPr>
+        <w:t>Dear [Sponsor Name],</w:t>
+      </w:r>
+    </w:p>
+    <w:p>
+      <w:pPr>
+        <w:rPr>
+          <w:i/>
+          <w:iCs/>
+          <w:lang w:val="en-GB"/>
+        </w:rPr>
+      </w:pPr>
+      <w:r>
+        <w:rPr>
+          <w:i/>
+          <w:iCs/>
+          <w:lang w:val="en-GB"/>
+        </w:rPr>
+        <w:t xml:space="preserve">Thank you once again for your partnership and support for </w:t>
+      </w:r>
+      <w:proofErr w:type="spellStart"/>
+      <w:r>
+        <w:rPr>
+          <w:i/>
+          <w:iCs/>
+          <w:lang w:val="en-GB"/>
+        </w:rPr>
+        <w:t>MunichTech</w:t>
+      </w:r>
+      <w:proofErr w:type="spellEnd"/>
+      <w:r>
+        <w:rPr>
+          <w:i/>
+          <w:iCs/>
+          <w:lang w:val="en-GB"/>
+        </w:rPr>
+        <w:t xml:space="preserve"> EXPO 2026.</w:t>
+      </w:r>
+    </w:p>
+    <w:p>
+      <w:pPr>
+        <w:rPr>
+          <w:i/>
+          <w:iCs/>
+          <w:lang w:val="en-GB"/>
+        </w:rPr>
+      </w:pPr>
+      <w:r>
+        <w:rPr>
+          <w:i/>
+          <w:iCs/>
+          <w:lang w:val="en-GB"/>
+        </w:rPr>
+        <w:t>We would like to follow up regarding the current onboarding and branding coordination process. Please kindly ensure that all branding materials, logo assets, and sponsorship deliverables are submitted before the scheduled operational deadline to support event preparation activities efficiently.</w:t>
+      </w:r>
+      <w:r>
+        <w:rPr>
+          <w:i/>
+          <w:iCs/>
+          <w:lang w:val="en-GB"/>
+        </w:rPr>
+        <w:t xml:space="preserve"> </w:t>
+      </w:r>
+      <w:r>
+        <w:rPr>
+          <w:i/>
+          <w:iCs/>
+          <w:lang w:val="en-GB"/>
+        </w:rPr>
+        <w:t>Our operations team remains available for any additional coordination support or clarification regarding sponsorship activation, booth setup, or networking opportunities during the event.</w:t>
+      </w:r>
+    </w:p>
+    <w:p>
+      <w:pPr>
+        <w:rPr>
+          <w:i/>
+          <w:iCs/>
+          <w:lang w:val="en-GB"/>
+        </w:rPr>
+      </w:pPr>
+      <w:r>
+        <w:rPr>
+          <w:i/>
+          <w:iCs/>
+          <w:lang w:val="en-GB"/>
+        </w:rPr>
+        <w:t xml:space="preserve">We appreciate your collaboration and look forward to working together to deliver a successful </w:t>
+      </w:r>
+      <w:proofErr w:type="spellStart"/>
+      <w:r>
+        <w:rPr>
+          <w:i/>
+          <w:iCs/>
+          <w:lang w:val="en-GB"/>
+        </w:rPr>
+        <w:t>MunichTech</w:t>
+      </w:r>
+      <w:proofErr w:type="spellEnd"/>
+      <w:r>
+        <w:rPr>
+          <w:i/>
+          <w:iCs/>
+          <w:lang w:val="en-GB"/>
+        </w:rPr>
+        <w:t xml:space="preserve"> EXPO 2026 experience.</w:t>
+      </w:r>
+    </w:p>
+    <w:p>
+      <w:pPr>
+        <w:rPr>
+          <w:i/>
+          <w:iCs/>
+          <w:lang w:val="en-GB"/>
+        </w:rPr>
+      </w:pPr>
+      <w:r>
+        <w:rPr>
+          <w:i/>
+          <w:iCs/>
+          <w:lang w:val="en-GB"/>
+        </w:rPr>
+        <w:t>Best regards,</w:t>
+      </w:r>
+      <w:r>
+        <w:rPr>
+          <w:i/>
+          <w:iCs/>
+          <w:lang w:val="en-GB"/>
+        </w:rPr>
+        <w:br/>
+      </w:r>
+      <w:proofErr w:type="spellStart"/>
+      <w:r>
+        <w:rPr>
+          <w:i/>
+          <w:iCs/>
+          <w:lang w:val="en-GB"/>
+        </w:rPr>
+        <w:t>MunichTech</w:t>
+      </w:r>
+      <w:proofErr w:type="spellEnd"/>
+      <w:r>
+        <w:rPr>
+          <w:i/>
+          <w:iCs/>
+          <w:lang w:val="en-GB"/>
+        </w:rPr>
+        <w:t xml:space="preserve"> EXPO Operations Team</w:t>
+      </w:r>
+    </w:p>
+    <w:p>
+      <w:pPr>
+        <w:pStyle w:val="Heading2"/>
+      </w:pPr>
+      <w:r>
+        <w:lastRenderedPageBreak/>
+        <w:t>Exhibitor Coordination</w:t>
+      </w:r>
+    </w:p>
+    <w:p>
+      <w:r>
+        <w:t>Exhibitor coordination processes support booth onboarding, operational setup alignment, venue logistics, and exhibitor communication management before and during the event. Structured onboarding communication and operational updates help exhibitors prepare efficiently while reducing setup delays and coordination bottlenecks.</w:t>
+      </w:r>
+    </w:p>
+    <w:p>
+      <w:pPr>
+        <w:pStyle w:val="Heading3"/>
+      </w:pPr>
+      <w:r>
+        <w:t>Example Exhibitor Onboarding Email</w:t>
+      </w:r>
+    </w:p>
+    <w:p>
+      <w:pPr>
+        <w:rPr>
+          <w:i/>
+          <w:iCs/>
+          <w:lang w:val="en-GB"/>
+        </w:rPr>
+      </w:pPr>
+      <w:r>
+        <w:rPr>
+          <w:b/>
+          <w:bCs/>
+          <w:i/>
+          <w:iCs/>
+          <w:lang w:val="en-GB"/>
+        </w:rPr>
+        <w:t>Subject:</w:t>
+      </w:r>
+      <w:r>
+        <w:rPr>
+          <w:i/>
+          <w:iCs/>
+          <w:lang w:val="en-GB"/>
+        </w:rPr>
+        <w:t xml:space="preserve"> </w:t>
+      </w:r>
+      <w:proofErr w:type="spellStart"/>
+      <w:r>
+        <w:rPr>
+          <w:i/>
+          <w:iCs/>
+          <w:lang w:val="en-GB"/>
+        </w:rPr>
+        <w:t>MunichTech</w:t>
+      </w:r>
+      <w:proofErr w:type="spellEnd"/>
+      <w:r>
+        <w:rPr>
+          <w:i/>
+          <w:iCs/>
+          <w:lang w:val="en-GB"/>
+        </w:rPr>
+        <w:t xml:space="preserve"> EXPO 2026 – Exhibitor Onboarding &amp; Operational Information</w:t>
+      </w:r>
+    </w:p>
+    <w:p>
+      <w:pPr>
+        <w:rPr>
+          <w:i/>
+          <w:iCs/>
+          <w:lang w:val="en-GB"/>
+        </w:rPr>
+      </w:pPr>
+      <w:r>
+        <w:rPr>
+          <w:i/>
+          <w:iCs/>
+          <w:lang w:val="en-GB"/>
+        </w:rPr>
+        <w:t>Dear [Exhibitor Name],</w:t>
+      </w:r>
+    </w:p>
+    <w:p>
+      <w:pPr>
+        <w:rPr>
+          <w:i/>
+          <w:iCs/>
+          <w:lang w:val="en-GB"/>
+        </w:rPr>
+      </w:pPr>
+      <w:r>
+        <w:rPr>
+          <w:i/>
+          <w:iCs/>
+          <w:lang w:val="en-GB"/>
+        </w:rPr>
+        <w:t xml:space="preserve">Welcome to </w:t>
+      </w:r>
+      <w:proofErr w:type="spellStart"/>
+      <w:r>
+        <w:rPr>
+          <w:i/>
+          <w:iCs/>
+          <w:lang w:val="en-GB"/>
+        </w:rPr>
+        <w:t>MunichTech</w:t>
+      </w:r>
+      <w:proofErr w:type="spellEnd"/>
+      <w:r>
+        <w:rPr>
+          <w:i/>
+          <w:iCs/>
+          <w:lang w:val="en-GB"/>
+        </w:rPr>
+        <w:t xml:space="preserve"> EXPO 2026, and thank you for joining our exhibitor ecosystem.</w:t>
+      </w:r>
+    </w:p>
+    <w:p>
+      <w:pPr>
+        <w:rPr>
+          <w:i/>
+          <w:iCs/>
+          <w:lang w:val="en-GB"/>
+        </w:rPr>
+      </w:pPr>
+      <w:r>
+        <w:rPr>
+          <w:i/>
+          <w:iCs/>
+          <w:lang w:val="en-GB"/>
+        </w:rPr>
+        <w:t>To support smooth operational preparation, please review the attached onboarding guidelines regarding booth setup schedules, branding requirements, logistics coordination, and venue access procedures.</w:t>
+      </w:r>
+    </w:p>
+    <w:p>
+      <w:pPr>
+        <w:rPr>
+          <w:i/>
+          <w:iCs/>
+          <w:lang w:val="en-GB"/>
+        </w:rPr>
+      </w:pPr>
+      <w:r>
+        <w:rPr>
+          <w:i/>
+          <w:iCs/>
+          <w:lang w:val="en-GB"/>
+        </w:rPr>
+        <w:t>Our operations team will continue providing updates regarding setup timelines, networking opportunities, and exhibitor coordination activities leading up to the event.</w:t>
+      </w:r>
+    </w:p>
+    <w:p>
+      <w:pPr>
+        <w:rPr>
+          <w:i/>
+          <w:iCs/>
+          <w:lang w:val="en-GB"/>
+        </w:rPr>
+      </w:pPr>
+      <w:r>
+        <w:rPr>
+          <w:i/>
+          <w:iCs/>
+          <w:lang w:val="en-GB"/>
+        </w:rPr>
+        <w:t>Please do not hesitate to contact us for any operational assistance or clarification.</w:t>
+      </w:r>
+    </w:p>
+    <w:p>
+      <w:pPr>
+        <w:rPr>
+          <w:i/>
+          <w:iCs/>
+          <w:lang w:val="en-GB"/>
+        </w:rPr>
+      </w:pPr>
+      <w:r>
+        <w:rPr>
+          <w:i/>
+          <w:iCs/>
+          <w:lang w:val="en-GB"/>
+        </w:rPr>
+        <w:t>Best regards,</w:t>
+      </w:r>
+      <w:r>
+        <w:rPr>
+          <w:i/>
+          <w:iCs/>
+          <w:lang w:val="en-GB"/>
+        </w:rPr>
+        <w:br/>
+      </w:r>
+      <w:proofErr w:type="spellStart"/>
+      <w:r>
+        <w:rPr>
+          <w:i/>
+          <w:iCs/>
+          <w:lang w:val="en-GB"/>
+        </w:rPr>
+        <w:t>MunichTech</w:t>
+      </w:r>
+      <w:proofErr w:type="spellEnd"/>
+      <w:r>
+        <w:rPr>
+          <w:i/>
+          <w:iCs/>
+          <w:lang w:val="en-GB"/>
+        </w:rPr>
+        <w:t xml:space="preserve"> EXPO Operations Team</w:t>
+      </w:r>
+    </w:p>
+    <w:p>
+      <w:pPr>
+        <w:pStyle w:val="Heading2"/>
+      </w:pPr>
+      <w:r>
+        <w:t>Internal Operations Coordination</w:t>
+      </w:r>
+    </w:p>
+    <w:p>
+      <w:r>
+        <w:t>Internal coordination processes help maintain operational visibility and alignment across event management teams, volunteers, technical support units, sponsor coordinators, and communication teams. Centralized operational updates and escalation channels improve responsiveness and support rapid decision-making during live event execution.</w:t>
+      </w:r>
+    </w:p>
+    <w:p>
+      <w:r>
+        <w:t>Example Internal Coordination Update</w:t>
+      </w:r>
+    </w:p>
+    <w:p>
+      <w:pPr>
+        <w:rPr>
+          <w:lang w:val="en-GB"/>
+        </w:rPr>
+      </w:pPr>
+      <w:r>
+        <w:rPr>
+          <w:b/>
+          <w:bCs/>
+          <w:lang w:val="en-GB"/>
+        </w:rPr>
+        <w:t>Subject:</w:t>
+      </w:r>
+      <w:r>
+        <w:rPr>
+          <w:lang w:val="en-GB"/>
+        </w:rPr>
+        <w:t xml:space="preserve"> </w:t>
+      </w:r>
+      <w:proofErr w:type="spellStart"/>
+      <w:r>
+        <w:rPr>
+          <w:lang w:val="en-GB"/>
+        </w:rPr>
+        <w:t>MunichTech</w:t>
+      </w:r>
+      <w:proofErr w:type="spellEnd"/>
+      <w:r>
+        <w:rPr>
+          <w:lang w:val="en-GB"/>
+        </w:rPr>
+        <w:t xml:space="preserve"> EXPO 2026 – Operational Coordination Update</w:t>
+      </w:r>
+    </w:p>
+    <w:p>
+      <w:pPr>
+        <w:rPr>
+          <w:i/>
+          <w:iCs/>
+          <w:lang w:val="en-GB"/>
+        </w:rPr>
+      </w:pPr>
+      <w:r>
+        <w:rPr>
+          <w:i/>
+          <w:iCs/>
+          <w:lang w:val="en-GB"/>
+        </w:rPr>
+        <w:t>Team,</w:t>
+      </w:r>
+    </w:p>
+    <w:p>
+      <w:pPr>
+        <w:rPr>
+          <w:i/>
+          <w:iCs/>
+          <w:lang w:val="en-GB"/>
+        </w:rPr>
+      </w:pPr>
+      <w:r>
+        <w:rPr>
+          <w:i/>
+          <w:iCs/>
+          <w:lang w:val="en-GB"/>
+        </w:rPr>
+        <w:t>Please be informed that current operational preparations remain on track across registration, sponsor coordination, hackathon preparation, and venue setup activities.</w:t>
+      </w:r>
+    </w:p>
+    <w:p>
+      <w:pPr>
+        <w:rPr>
+          <w:i/>
+          <w:iCs/>
+          <w:lang w:val="en-GB"/>
+        </w:rPr>
+      </w:pPr>
+      <w:r>
+        <w:rPr>
+          <w:i/>
+          <w:iCs/>
+          <w:lang w:val="en-GB"/>
+        </w:rPr>
+        <w:t>The operations dashboard and escalation monitoring systems will continue tracking operational readiness throughout the remaining preparation period. All teams are requested to monitor pending action items and ensure milestone completion before the next coordination review meeting.</w:t>
+      </w:r>
+    </w:p>
+    <w:p>
+      <w:pPr>
+        <w:rPr>
+          <w:i/>
+          <w:iCs/>
+          <w:lang w:val="en-GB"/>
+        </w:rPr>
+      </w:pPr>
+      <w:r>
+        <w:rPr>
+          <w:i/>
+          <w:iCs/>
+          <w:lang w:val="en-GB"/>
+        </w:rPr>
+        <w:t>Please escalate any operational blockers immediately through the centralized coordination channels.</w:t>
+      </w:r>
+    </w:p>
+    <w:p>
+      <w:pPr>
+        <w:rPr>
+          <w:i/>
+          <w:iCs/>
+          <w:lang w:val="en-GB"/>
+        </w:rPr>
+      </w:pPr>
+      <w:r>
+        <w:rPr>
+          <w:i/>
+          <w:iCs/>
+          <w:lang w:val="en-GB"/>
+        </w:rPr>
+        <w:lastRenderedPageBreak/>
+        <w:t>Thank you all for your continued collaboration and support.</w:t>
+      </w:r>
+    </w:p>
+    <w:p>
+      <w:pPr>
+        <w:rPr>
+          <w:i/>
+          <w:iCs/>
+          <w:lang w:val="en-GB"/>
+        </w:rPr>
+      </w:pPr>
+      <w:proofErr w:type="spellStart"/>
+      <w:r>
+        <w:rPr>
+          <w:i/>
+          <w:iCs/>
+          <w:lang w:val="en-GB"/>
+        </w:rPr>
+        <w:t>MunichTech</w:t>
+      </w:r>
+      <w:proofErr w:type="spellEnd"/>
+      <w:r>
+        <w:rPr>
+          <w:i/>
+          <w:iCs/>
+          <w:lang w:val="en-GB"/>
+        </w:rPr>
+        <w:t xml:space="preserve"> EXPO Operations Coordination Team</w:t>
+      </w:r>
+    </w:p>
+    <w:p/>
+    <w:p>
+      <w:pPr>
+        <w:pStyle w:val="Heading2"/>
+      </w:pPr>
+      <w:r>
+        <w:t>AI-Supported Communication Systems</w:t>
+      </w:r>
+    </w:p>
+    <w:p>
+      <w:r>
+        <w:t xml:space="preserve">AI-supported communication systems improve operational responsiveness through automated reminders, intelligent notification systems, centralized coordination alerts, and AI-generated operational summaries. These systems help reduce communication delays, improve stakeholder visibility, and support scalable event coordination across multiple operational environments during </w:t>
+      </w:r>
+      <w:proofErr w:type="spellStart"/>
+      <w:r>
+        <w:t>MunichTech</w:t>
+      </w:r>
+      <w:proofErr w:type="spellEnd"/>
+      <w:r>
+        <w:t xml:space="preserve"> EXPO 2026.</w:t>
+      </w:r>
+    </w:p>
+    <w:p/>
+    <w:p>
+      <w:pPr>
+        <w:rPr>
+          <w:lang w:val="en-GB"/>
+        </w:rPr>
+      </w:pPr>
     </w:p>
     <w:p/>
     <w:sectPr>

</xml_diff>

<commit_message>
Completed Part 1 operational planning and governance framework
</commit_message>
<xml_diff>
--- a/01_Report/MunichTech_EXPO_Operations_Proposal_Starter.docx
+++ b/01_Report/MunichTech_EXPO_Operations_Proposal_Starter.docx
@@ -97,9 +97,32 @@
       </w:r>
     </w:p>
     <w:p>
+      <w:pPr>
+        <w:rPr>
+          <w:lang w:val="en-GB"/>
+        </w:rPr>
+      </w:pPr>
       <w:r>
         <w:br/>
-        <w:t>The operational structure of MunichTech EXPO 2026 is designed to ensure scalable coordination, efficient communication, and smooth execution across all event functions.</w:t>
+      </w:r>
+      <w:r>
+        <w:rPr>
+          <w:lang w:val="en-GB"/>
+        </w:rPr>
+        <w:t>The operational structure of MunichTech EXPO 2026 was designed to support scalable coordination, efficient communication, and smooth execution across all event functions. The operational framework integrates attendee management, sponsor coordination, speaker onboarding, volunteer coordination, and operational monitoring systems to improve visibility and execution consistency throughout the event lifecycle.</w:t>
+      </w:r>
+    </w:p>
+    <w:p>
+      <w:pPr>
+        <w:rPr>
+          <w:lang w:val="en-GB"/>
+        </w:rPr>
+      </w:pPr>
+      <w:r>
+        <w:rPr>
+          <w:lang w:val="en-GB"/>
+        </w:rPr>
+        <w:t>The event operations structure also integrates centralized coordination processes, escalation management systems, and AI-supported operational monitoring to improve responsiveness during both preparation and live execution phases.</w:t>
       </w:r>
       <w:r>
         <w:br/>
@@ -108,15 +131,24 @@
     <w:p>
       <w:pPr>
         <w:pStyle w:val="Heading2"/>
+        <w:numPr>
+          <w:ilvl w:val="0"/>
+          <w:numId w:val="10"/>
+        </w:numPr>
       </w:pPr>
       <w:r>
-        <w:t>A. Event Operations Structure</w:t>
+        <w:t>Event Operations Structure</w:t>
+      </w:r>
+    </w:p>
+    <w:p>
+      <w:r>
+        <w:t>The MunichTech EXPO 2026 operational structure is divided into multiple operational areas to improve coordination efficiency, accountability, and operational visibility across all event activities. Each operational unit supports a specific aspect of event execution while remaining connected through centralized coordination and reporting systems.</w:t>
       </w:r>
     </w:p>
     <w:tbl>
       <w:tblPr>
         <w:tblStyle w:val="TableGrid"/>
-        <w:tblW w:w="0" w:type="auto"/>
+        <w:tblW w:w="5000" w:type="pct"/>
         <w:tblLook w:val="04A0" w:firstRow="1" w:lastRow="0" w:firstColumn="1" w:lastColumn="0" w:noHBand="0" w:noVBand="1"/>
       </w:tblPr>
       <w:tblGrid>
@@ -128,7 +160,7 @@
       <w:tr>
         <w:tc>
           <w:tcPr>
-            <w:tcW w:w="2160" w:type="dxa"/>
+            <w:tcW w:w="1250" w:type="pct"/>
           </w:tcPr>
           <w:p>
             <w:pPr>
@@ -148,7 +180,7 @@
         </w:tc>
         <w:tc>
           <w:tcPr>
-            <w:tcW w:w="2160" w:type="dxa"/>
+            <w:tcW w:w="1251" w:type="pct"/>
           </w:tcPr>
           <w:p>
             <w:pPr>
@@ -168,7 +200,7 @@
         </w:tc>
         <w:tc>
           <w:tcPr>
-            <w:tcW w:w="2160" w:type="dxa"/>
+            <w:tcW w:w="1250" w:type="pct"/>
           </w:tcPr>
           <w:p>
             <w:pPr>
@@ -188,7 +220,7 @@
         </w:tc>
         <w:tc>
           <w:tcPr>
-            <w:tcW w:w="2160" w:type="dxa"/>
+            <w:tcW w:w="1249" w:type="pct"/>
           </w:tcPr>
           <w:p>
             <w:pPr>
@@ -210,7 +242,7 @@
       <w:tr>
         <w:tc>
           <w:tcPr>
-            <w:tcW w:w="2160" w:type="dxa"/>
+            <w:tcW w:w="1250" w:type="pct"/>
           </w:tcPr>
           <w:p>
             <w:r>
@@ -220,7 +252,7 @@
         </w:tc>
         <w:tc>
           <w:tcPr>
-            <w:tcW w:w="2160" w:type="dxa"/>
+            <w:tcW w:w="1251" w:type="pct"/>
           </w:tcPr>
           <w:p>
             <w:r>
@@ -230,7 +262,7 @@
         </w:tc>
         <w:tc>
           <w:tcPr>
-            <w:tcW w:w="2160" w:type="dxa"/>
+            <w:tcW w:w="1250" w:type="pct"/>
           </w:tcPr>
           <w:p>
             <w:r>
@@ -240,7 +272,7 @@
         </w:tc>
         <w:tc>
           <w:tcPr>
-            <w:tcW w:w="2160" w:type="dxa"/>
+            <w:tcW w:w="1249" w:type="pct"/>
           </w:tcPr>
           <w:p>
             <w:r>
@@ -252,7 +284,7 @@
       <w:tr>
         <w:tc>
           <w:tcPr>
-            <w:tcW w:w="2160" w:type="dxa"/>
+            <w:tcW w:w="1250" w:type="pct"/>
           </w:tcPr>
           <w:p>
             <w:r>
@@ -262,7 +294,7 @@
         </w:tc>
         <w:tc>
           <w:tcPr>
-            <w:tcW w:w="2160" w:type="dxa"/>
+            <w:tcW w:w="1251" w:type="pct"/>
           </w:tcPr>
           <w:p>
             <w:r>
@@ -272,7 +304,7 @@
         </w:tc>
         <w:tc>
           <w:tcPr>
-            <w:tcW w:w="2160" w:type="dxa"/>
+            <w:tcW w:w="1250" w:type="pct"/>
           </w:tcPr>
           <w:p>
             <w:r>
@@ -282,7 +314,7 @@
         </w:tc>
         <w:tc>
           <w:tcPr>
-            <w:tcW w:w="2160" w:type="dxa"/>
+            <w:tcW w:w="1249" w:type="pct"/>
           </w:tcPr>
           <w:p>
             <w:r>
@@ -294,7 +326,7 @@
       <w:tr>
         <w:tc>
           <w:tcPr>
-            <w:tcW w:w="2160" w:type="dxa"/>
+            <w:tcW w:w="1250" w:type="pct"/>
           </w:tcPr>
           <w:p>
             <w:r>
@@ -304,7 +336,7 @@
         </w:tc>
         <w:tc>
           <w:tcPr>
-            <w:tcW w:w="2160" w:type="dxa"/>
+            <w:tcW w:w="1251" w:type="pct"/>
           </w:tcPr>
           <w:p>
             <w:r>
@@ -314,7 +346,7 @@
         </w:tc>
         <w:tc>
           <w:tcPr>
-            <w:tcW w:w="2160" w:type="dxa"/>
+            <w:tcW w:w="1250" w:type="pct"/>
           </w:tcPr>
           <w:p>
             <w:r>
@@ -324,7 +356,7 @@
         </w:tc>
         <w:tc>
           <w:tcPr>
-            <w:tcW w:w="2160" w:type="dxa"/>
+            <w:tcW w:w="1249" w:type="pct"/>
           </w:tcPr>
           <w:p>
             <w:r>
@@ -336,7 +368,7 @@
       <w:tr>
         <w:tc>
           <w:tcPr>
-            <w:tcW w:w="2160" w:type="dxa"/>
+            <w:tcW w:w="1250" w:type="pct"/>
           </w:tcPr>
           <w:p>
             <w:r>
@@ -346,7 +378,7 @@
         </w:tc>
         <w:tc>
           <w:tcPr>
-            <w:tcW w:w="2160" w:type="dxa"/>
+            <w:tcW w:w="1251" w:type="pct"/>
           </w:tcPr>
           <w:p>
             <w:r>
@@ -356,7 +388,7 @@
         </w:tc>
         <w:tc>
           <w:tcPr>
-            <w:tcW w:w="2160" w:type="dxa"/>
+            <w:tcW w:w="1250" w:type="pct"/>
           </w:tcPr>
           <w:p>
             <w:r>
@@ -366,20 +398,148 @@
         </w:tc>
         <w:tc>
           <w:tcPr>
-            <w:tcW w:w="2160" w:type="dxa"/>
+            <w:tcW w:w="1249" w:type="pct"/>
           </w:tcPr>
           <w:p>
             <w:r>
               <w:t>Full shift coverage</w:t>
+            </w:r>
+          </w:p>
+        </w:tc>
+      </w:tr>
+      <w:tr>
+        <w:tc>
+          <w:tcPr>
+            <w:tcW w:w="1250" w:type="pct"/>
+          </w:tcPr>
+          <w:p>
+            <w:r>
+              <w:t>Technical Support</w:t>
+            </w:r>
+          </w:p>
+        </w:tc>
+        <w:tc>
+          <w:tcPr>
+            <w:tcW w:w="1251" w:type="pct"/>
+          </w:tcPr>
+          <w:p>
+            <w:r>
+              <w:t>AV systems, connectivity</w:t>
+            </w:r>
+          </w:p>
+        </w:tc>
+        <w:tc>
+          <w:tcPr>
+            <w:tcW w:w="1250" w:type="pct"/>
+          </w:tcPr>
+          <w:p>
+            <w:r>
+              <w:t>Internet infrastructure</w:t>
+            </w:r>
+          </w:p>
+        </w:tc>
+        <w:tc>
+          <w:tcPr>
+            <w:tcW w:w="1249" w:type="pct"/>
+          </w:tcPr>
+          <w:p>
+            <w:r>
+              <w:t>Minimal technical disruptions</w:t>
+            </w:r>
+          </w:p>
+        </w:tc>
+      </w:tr>
+      <w:tr>
+        <w:tc>
+          <w:tcPr>
+            <w:tcW w:w="1250" w:type="pct"/>
+          </w:tcPr>
+          <w:p>
+            <w:r>
+              <w:lastRenderedPageBreak/>
+              <w:t>Operations Command Team</w:t>
+            </w:r>
+          </w:p>
+        </w:tc>
+        <w:tc>
+          <w:tcPr>
+            <w:tcW w:w="1251" w:type="pct"/>
+          </w:tcPr>
+          <w:p>
+            <w:r>
+              <w:t>Escalation management, coordination</w:t>
+            </w:r>
+          </w:p>
+        </w:tc>
+        <w:tc>
+          <w:tcPr>
+            <w:tcW w:w="1250" w:type="pct"/>
+          </w:tcPr>
+          <w:p>
+            <w:r>
+              <w:t>All operational units</w:t>
+            </w:r>
+          </w:p>
+        </w:tc>
+        <w:tc>
+          <w:tcPr>
+            <w:tcW w:w="1249" w:type="pct"/>
+          </w:tcPr>
+          <w:p>
+            <w:r>
+              <w:t>Real-time operational visibility</w:t>
             </w:r>
           </w:p>
         </w:tc>
       </w:tr>
     </w:tbl>
+    <w:p/>
     <w:p>
       <w:r>
+        <w:t>The operational structure improves accountability, communication flow, and coordination consistency across registration, sponsor management, speaker preparation, volunteer activities, and technical operations during MunichTech EXPO 2026.</w:t>
+      </w:r>
+      <w:r>
         <w:br/>
-        <w:t>[Insert Figure 1: Event Operations Organizational Structure]</w:t>
+      </w:r>
+      <w:r>
+        <w:rPr>
+          <w:noProof/>
+        </w:rPr>
+        <w:drawing>
+          <wp:inline distT="0" distB="0" distL="0" distR="0" wp14:anchorId="2AB1C67E" wp14:editId="55EF57C1">
+            <wp:extent cx="5486400" cy="3657600"/>
+            <wp:effectExtent l="0" t="0" r="0" b="0"/>
+            <wp:docPr id="1447535121" name="Picture 2"/>
+            <wp:cNvGraphicFramePr>
+              <a:graphicFrameLocks xmlns:a="http://schemas.openxmlformats.org/drawingml/2006/main" noChangeAspect="1"/>
+            </wp:cNvGraphicFramePr>
+            <a:graphic xmlns:a="http://schemas.openxmlformats.org/drawingml/2006/main">
+              <a:graphicData uri="http://schemas.openxmlformats.org/drawingml/2006/picture">
+                <pic:pic xmlns:pic="http://schemas.openxmlformats.org/drawingml/2006/picture">
+                  <pic:nvPicPr>
+                    <pic:cNvPr id="1447535121" name="Picture 1447535121"/>
+                    <pic:cNvPicPr/>
+                  </pic:nvPicPr>
+                  <pic:blipFill>
+                    <a:blip r:embed="rId6"/>
+                    <a:stretch>
+                      <a:fillRect/>
+                    </a:stretch>
+                  </pic:blipFill>
+                  <pic:spPr>
+                    <a:xfrm>
+                      <a:off x="0" y="0"/>
+                      <a:ext cx="5486400" cy="3657600"/>
+                    </a:xfrm>
+                    <a:prstGeom prst="rect">
+                      <a:avLst/>
+                    </a:prstGeom>
+                  </pic:spPr>
+                </pic:pic>
+              </a:graphicData>
+            </a:graphic>
+          </wp:inline>
+        </w:drawing>
       </w:r>
       <w:r>
         <w:br/>
@@ -388,9 +548,399 @@
     <w:p>
       <w:pPr>
         <w:pStyle w:val="Heading2"/>
+        <w:numPr>
+          <w:ilvl w:val="0"/>
+          <w:numId w:val="10"/>
+        </w:numPr>
       </w:pPr>
       <w:r>
-        <w:t>B. Critical Workflows</w:t>
+        <w:t>Critical Workflows</w:t>
+      </w:r>
+    </w:p>
+    <w:p>
+      <w:pPr>
+        <w:ind w:left="360"/>
+      </w:pPr>
+      <w:r>
+        <w:t>The MunichTech EXPO 2026 operational framework integrates multiple workflows designed to improve attendee onboarding, speaker coordination, sponsor activation, and operational execution consistency throughout the event lifecycle.</w:t>
+      </w:r>
+    </w:p>
+    <w:tbl>
+      <w:tblPr>
+        <w:tblStyle w:val="TableGrid"/>
+        <w:tblW w:w="5000" w:type="pct"/>
+        <w:tblLook w:val="04A0" w:firstRow="1" w:lastRow="0" w:firstColumn="1" w:lastColumn="0" w:noHBand="0" w:noVBand="1"/>
+      </w:tblPr>
+      <w:tblGrid>
+        <w:gridCol w:w="2876"/>
+        <w:gridCol w:w="2877"/>
+        <w:gridCol w:w="2877"/>
+      </w:tblGrid>
+      <w:tr>
+        <w:tc>
+          <w:tcPr>
+            <w:tcW w:w="1666" w:type="pct"/>
+          </w:tcPr>
+          <w:p>
+            <w:pPr>
+              <w:rPr>
+                <w:b/>
+                <w:bCs/>
+              </w:rPr>
+            </w:pPr>
+            <w:r>
+              <w:rPr>
+                <w:b/>
+                <w:bCs/>
+              </w:rPr>
+              <w:t>Workflow</w:t>
+            </w:r>
+          </w:p>
+        </w:tc>
+        <w:tc>
+          <w:tcPr>
+            <w:tcW w:w="1667" w:type="pct"/>
+          </w:tcPr>
+          <w:p>
+            <w:pPr>
+              <w:rPr>
+                <w:b/>
+                <w:bCs/>
+              </w:rPr>
+            </w:pPr>
+            <w:r>
+              <w:rPr>
+                <w:b/>
+                <w:bCs/>
+              </w:rPr>
+              <w:t>Process Flow</w:t>
+            </w:r>
+          </w:p>
+        </w:tc>
+        <w:tc>
+          <w:tcPr>
+            <w:tcW w:w="1667" w:type="pct"/>
+          </w:tcPr>
+          <w:p>
+            <w:pPr>
+              <w:rPr>
+                <w:b/>
+                <w:bCs/>
+              </w:rPr>
+            </w:pPr>
+            <w:r>
+              <w:rPr>
+                <w:b/>
+                <w:bCs/>
+              </w:rPr>
+              <w:t>Operational Goal</w:t>
+            </w:r>
+          </w:p>
+        </w:tc>
+      </w:tr>
+      <w:tr>
+        <w:tc>
+          <w:tcPr>
+            <w:tcW w:w="1666" w:type="pct"/>
+          </w:tcPr>
+          <w:p>
+            <w:pPr>
+              <w:rPr>
+                <w:b/>
+                <w:bCs/>
+              </w:rPr>
+            </w:pPr>
+            <w:r>
+              <w:rPr>
+                <w:b/>
+                <w:bCs/>
+              </w:rPr>
+              <w:t>Attendee Journey</w:t>
+            </w:r>
+          </w:p>
+        </w:tc>
+        <w:tc>
+          <w:tcPr>
+            <w:tcW w:w="1667" w:type="pct"/>
+          </w:tcPr>
+          <w:p>
+            <w:r>
+              <w:t>Registration → QR Code → Check-In → Badge</w:t>
+            </w:r>
+            <w:r>
+              <w:t xml:space="preserve"> collection</w:t>
+            </w:r>
+          </w:p>
+        </w:tc>
+        <w:tc>
+          <w:tcPr>
+            <w:tcW w:w="1667" w:type="pct"/>
+          </w:tcPr>
+          <w:p>
+            <w:r>
+              <w:t>Fast attendee onboarding</w:t>
+            </w:r>
+          </w:p>
+        </w:tc>
+      </w:tr>
+      <w:tr>
+        <w:tc>
+          <w:tcPr>
+            <w:tcW w:w="1666" w:type="pct"/>
+          </w:tcPr>
+          <w:p>
+            <w:pPr>
+              <w:rPr>
+                <w:b/>
+                <w:bCs/>
+              </w:rPr>
+            </w:pPr>
+            <w:r>
+              <w:rPr>
+                <w:b/>
+                <w:bCs/>
+              </w:rPr>
+              <w:t>Speaker Workflow</w:t>
+            </w:r>
+          </w:p>
+        </w:tc>
+        <w:tc>
+          <w:tcPr>
+            <w:tcW w:w="1667" w:type="pct"/>
+          </w:tcPr>
+          <w:p>
+            <w:pPr>
+              <w:rPr>
+                <w:lang w:val="en-GB"/>
+              </w:rPr>
+            </w:pPr>
+            <w:r>
+              <w:rPr>
+                <w:lang w:val="en-GB"/>
+              </w:rPr>
+              <w:t>Invitation → Confirmation → Briefing → Session</w:t>
+            </w:r>
+            <w:r>
+              <w:rPr>
+                <w:lang w:val="en-GB"/>
+              </w:rPr>
+              <w:t xml:space="preserve"> delivery</w:t>
+            </w:r>
+          </w:p>
+        </w:tc>
+        <w:tc>
+          <w:tcPr>
+            <w:tcW w:w="1667" w:type="pct"/>
+          </w:tcPr>
+          <w:p>
+            <w:r>
+              <w:t>Speaker readiness</w:t>
+            </w:r>
+          </w:p>
+        </w:tc>
+      </w:tr>
+      <w:tr>
+        <w:tc>
+          <w:tcPr>
+            <w:tcW w:w="1666" w:type="pct"/>
+          </w:tcPr>
+          <w:p>
+            <w:pPr>
+              <w:rPr>
+                <w:b/>
+                <w:bCs/>
+              </w:rPr>
+            </w:pPr>
+            <w:r>
+              <w:rPr>
+                <w:b/>
+                <w:bCs/>
+              </w:rPr>
+              <w:t>Sponsor Workflow</w:t>
+            </w:r>
+          </w:p>
+        </w:tc>
+        <w:tc>
+          <w:tcPr>
+            <w:tcW w:w="1667" w:type="pct"/>
+          </w:tcPr>
+          <w:p>
+            <w:r>
+              <w:t>Agreement → Branding → Booth Setup</w:t>
+            </w:r>
+          </w:p>
+        </w:tc>
+        <w:tc>
+          <w:tcPr>
+            <w:tcW w:w="1667" w:type="pct"/>
+          </w:tcPr>
+          <w:p>
+            <w:r>
+              <w:t>Sponsor visibility</w:t>
+            </w:r>
+          </w:p>
+        </w:tc>
+      </w:tr>
+      <w:tr>
+        <w:tc>
+          <w:tcPr>
+            <w:tcW w:w="1666" w:type="pct"/>
+          </w:tcPr>
+          <w:p>
+            <w:pPr>
+              <w:rPr>
+                <w:b/>
+                <w:bCs/>
+              </w:rPr>
+            </w:pPr>
+            <w:r>
+              <w:rPr>
+                <w:b/>
+                <w:bCs/>
+              </w:rPr>
+              <w:t>Volunteer Workflow</w:t>
+            </w:r>
+          </w:p>
+        </w:tc>
+        <w:tc>
+          <w:tcPr>
+            <w:tcW w:w="1667" w:type="pct"/>
+          </w:tcPr>
+          <w:p>
+            <w:r>
+              <w:t>Registration → Scheduling → Shift Assignment → Support Execution</w:t>
+            </w:r>
+          </w:p>
+        </w:tc>
+        <w:tc>
+          <w:tcPr>
+            <w:tcW w:w="1667" w:type="pct"/>
+          </w:tcPr>
+          <w:p>
+            <w:r>
+              <w:t>Staffing coordination</w:t>
+            </w:r>
+          </w:p>
+        </w:tc>
+      </w:tr>
+      <w:tr>
+        <w:tc>
+          <w:tcPr>
+            <w:tcW w:w="1666" w:type="pct"/>
+          </w:tcPr>
+          <w:p>
+            <w:pPr>
+              <w:rPr>
+                <w:b/>
+                <w:bCs/>
+              </w:rPr>
+            </w:pPr>
+            <w:r>
+              <w:rPr>
+                <w:b/>
+                <w:bCs/>
+              </w:rPr>
+              <w:lastRenderedPageBreak/>
+              <w:t>Incident Escalation Workflow</w:t>
+            </w:r>
+          </w:p>
+        </w:tc>
+        <w:tc>
+          <w:tcPr>
+            <w:tcW w:w="1667" w:type="pct"/>
+          </w:tcPr>
+          <w:p>
+            <w:r>
+              <w:t>Detection → Classification → Response → Stabilization</w:t>
+            </w:r>
+          </w:p>
+        </w:tc>
+        <w:tc>
+          <w:tcPr>
+            <w:tcW w:w="1667" w:type="pct"/>
+          </w:tcPr>
+          <w:p>
+            <w:r>
+              <w:t>Rapid operational recovery</w:t>
+            </w:r>
+          </w:p>
+        </w:tc>
+      </w:tr>
+    </w:tbl>
+    <w:p>
+      <w:r>
+        <w:br/>
+      </w:r>
+      <w:r>
+        <w:t>These workflows improve operational visibility, reduce coordination bottlenecks, and support structured event execution across multiple operational environments during MunichTech EXPO 2026.</w:t>
+      </w:r>
+    </w:p>
+    <w:p>
+      <w:r>
+        <w:rPr>
+          <w:noProof/>
+        </w:rPr>
+        <w:drawing>
+          <wp:inline distT="0" distB="0" distL="0" distR="0" wp14:anchorId="22909325" wp14:editId="5C90CAB8">
+            <wp:extent cx="5486400" cy="4013200"/>
+            <wp:effectExtent l="0" t="0" r="0" b="6350"/>
+            <wp:docPr id="1998463494" name="Picture 3"/>
+            <wp:cNvGraphicFramePr>
+              <a:graphicFrameLocks xmlns:a="http://schemas.openxmlformats.org/drawingml/2006/main" noChangeAspect="1"/>
+            </wp:cNvGraphicFramePr>
+            <a:graphic xmlns:a="http://schemas.openxmlformats.org/drawingml/2006/main">
+              <a:graphicData uri="http://schemas.openxmlformats.org/drawingml/2006/picture">
+                <pic:pic xmlns:pic="http://schemas.openxmlformats.org/drawingml/2006/picture">
+                  <pic:nvPicPr>
+                    <pic:cNvPr id="1998463494" name="Picture 1998463494"/>
+                    <pic:cNvPicPr/>
+                  </pic:nvPicPr>
+                  <pic:blipFill>
+                    <a:blip r:embed="rId7"/>
+                    <a:stretch>
+                      <a:fillRect/>
+                    </a:stretch>
+                  </pic:blipFill>
+                  <pic:spPr>
+                    <a:xfrm>
+                      <a:off x="0" y="0"/>
+                      <a:ext cx="5486400" cy="4013200"/>
+                    </a:xfrm>
+                    <a:prstGeom prst="rect">
+                      <a:avLst/>
+                    </a:prstGeom>
+                  </pic:spPr>
+                </pic:pic>
+              </a:graphicData>
+            </a:graphic>
+          </wp:inline>
+        </w:drawing>
+      </w:r>
+      <w:r>
+        <w:br/>
+      </w:r>
+    </w:p>
+    <w:p>
+      <w:pPr>
+        <w:pStyle w:val="Heading2"/>
+        <w:numPr>
+          <w:ilvl w:val="0"/>
+          <w:numId w:val="10"/>
+        </w:numPr>
+      </w:pPr>
+      <w:r>
+        <w:t xml:space="preserve">Operational </w:t>
+      </w:r>
+      <w:r>
+        <w:t>Timeline &amp; Execution Roadmap</w:t>
+      </w:r>
+    </w:p>
+    <w:p>
+      <w:pPr>
+        <w:pStyle w:val="ListParagraph"/>
+      </w:pPr>
+      <w:r>
+        <w:t>The operational execution roadmap supports structured preparation, execution monitoring, and post-event evaluation across the MunichTech EXPO 2026 lifecycle. The timeline structure improves coordination visibility and helps operational teams prioritize activities efficiently throughout the preparation period.</w:t>
       </w:r>
     </w:p>
     <w:tbl>
@@ -410,18 +960,8 @@
             <w:tcW w:w="2880" w:type="dxa"/>
           </w:tcPr>
           <w:p>
-            <w:pPr>
-              <w:rPr>
-                <w:b/>
-                <w:bCs/>
-              </w:rPr>
-            </w:pPr>
-            <w:r>
-              <w:rPr>
-                <w:b/>
-                <w:bCs/>
-              </w:rPr>
-              <w:t>Workflow</w:t>
+            <w:r>
+              <w:t>Timeline Phase</w:t>
             </w:r>
           </w:p>
         </w:tc>
@@ -430,18 +970,8 @@
             <w:tcW w:w="2880" w:type="dxa"/>
           </w:tcPr>
           <w:p>
-            <w:pPr>
-              <w:rPr>
-                <w:b/>
-                <w:bCs/>
-              </w:rPr>
-            </w:pPr>
-            <w:r>
-              <w:rPr>
-                <w:b/>
-                <w:bCs/>
-              </w:rPr>
-              <w:t>Process Flow</w:t>
+            <w:r>
+              <w:t>Main Activities</w:t>
             </w:r>
           </w:p>
         </w:tc>
@@ -450,18 +980,8 @@
             <w:tcW w:w="2880" w:type="dxa"/>
           </w:tcPr>
           <w:p>
-            <w:pPr>
-              <w:rPr>
-                <w:b/>
-                <w:bCs/>
-              </w:rPr>
-            </w:pPr>
-            <w:r>
-              <w:rPr>
-                <w:b/>
-                <w:bCs/>
-              </w:rPr>
-              <w:t>Operational Goal</w:t>
+            <w:r>
+              <w:t>Operational Focus</w:t>
             </w:r>
           </w:p>
         </w:tc>
@@ -472,18 +992,8 @@
             <w:tcW w:w="2880" w:type="dxa"/>
           </w:tcPr>
           <w:p>
-            <w:pPr>
-              <w:rPr>
-                <w:b/>
-                <w:bCs/>
-              </w:rPr>
-            </w:pPr>
-            <w:r>
-              <w:rPr>
-                <w:b/>
-                <w:bCs/>
-              </w:rPr>
-              <w:t>Attendee Journey</w:t>
+            <w:r>
+              <w:t>90 Days Before</w:t>
             </w:r>
           </w:p>
         </w:tc>
@@ -493,7 +1003,7 @@
           </w:tcPr>
           <w:p>
             <w:r>
-              <w:t>Registration → QR Code → Check-In → Badge</w:t>
+              <w:t>Sponsor outreach, venue planning</w:t>
             </w:r>
           </w:p>
         </w:tc>
@@ -503,7 +1013,7 @@
           </w:tcPr>
           <w:p>
             <w:r>
-              <w:t>Fast attendee onboarding</w:t>
+              <w:t>Strategic preparation</w:t>
             </w:r>
           </w:p>
         </w:tc>
@@ -514,18 +1024,8 @@
             <w:tcW w:w="2880" w:type="dxa"/>
           </w:tcPr>
           <w:p>
-            <w:pPr>
-              <w:rPr>
-                <w:b/>
-                <w:bCs/>
-              </w:rPr>
-            </w:pPr>
-            <w:r>
-              <w:rPr>
-                <w:b/>
-                <w:bCs/>
-              </w:rPr>
-              <w:t>Speaker Workflow</w:t>
+            <w:r>
+              <w:t>30 Days Before</w:t>
             </w:r>
           </w:p>
         </w:tc>
@@ -535,7 +1035,10 @@
           </w:tcPr>
           <w:p>
             <w:r>
-              <w:t>Invitation → Confirmation → Briefing → Session</w:t>
+              <w:t>Agenda finalization, volunteers</w:t>
+            </w:r>
+            <w:r>
+              <w:t xml:space="preserve"> coordination</w:t>
             </w:r>
           </w:p>
         </w:tc>
@@ -545,7 +1048,7 @@
           </w:tcPr>
           <w:p>
             <w:r>
-              <w:t>Speaker readiness</w:t>
+              <w:t>Coordination</w:t>
             </w:r>
           </w:p>
         </w:tc>
@@ -556,18 +1059,8 @@
             <w:tcW w:w="2880" w:type="dxa"/>
           </w:tcPr>
           <w:p>
-            <w:pPr>
-              <w:rPr>
-                <w:b/>
-                <w:bCs/>
-              </w:rPr>
-            </w:pPr>
-            <w:r>
-              <w:rPr>
-                <w:b/>
-                <w:bCs/>
-              </w:rPr>
-              <w:t>Sponsor Workflow</w:t>
+            <w:r>
+              <w:t>7 Days Before</w:t>
             </w:r>
           </w:p>
         </w:tc>
@@ -577,7 +1070,10 @@
           </w:tcPr>
           <w:p>
             <w:r>
-              <w:t>Agreement → Branding → Booth Setup</w:t>
+              <w:t>Testing, briefings</w:t>
+            </w:r>
+            <w:r>
+              <w:t>, operational rehearsals</w:t>
             </w:r>
           </w:p>
         </w:tc>
@@ -587,73 +1083,7 @@
           </w:tcPr>
           <w:p>
             <w:r>
-              <w:t>Sponsor visibility</w:t>
-            </w:r>
-          </w:p>
-        </w:tc>
-      </w:tr>
-    </w:tbl>
-    <w:p>
-      <w:r>
-        <w:br/>
-      </w:r>
-    </w:p>
-    <w:p>
-      <w:r>
-        <w:lastRenderedPageBreak/>
-        <w:t>[Insert Figure 2: Workflow Process Diagram]</w:t>
-      </w:r>
-      <w:r>
-        <w:br/>
-      </w:r>
-    </w:p>
-    <w:p>
-      <w:pPr>
-        <w:pStyle w:val="Heading2"/>
-      </w:pPr>
-      <w:r>
-        <w:t>C. Timeline &amp; Execution Roadmap</w:t>
-      </w:r>
-    </w:p>
-    <w:tbl>
-      <w:tblPr>
-        <w:tblStyle w:val="TableGrid"/>
-        <w:tblW w:w="0" w:type="auto"/>
-        <w:tblLook w:val="04A0" w:firstRow="1" w:lastRow="0" w:firstColumn="1" w:lastColumn="0" w:noHBand="0" w:noVBand="1"/>
-      </w:tblPr>
-      <w:tblGrid>
-        <w:gridCol w:w="2876"/>
-        <w:gridCol w:w="2877"/>
-        <w:gridCol w:w="2877"/>
-      </w:tblGrid>
-      <w:tr>
-        <w:tc>
-          <w:tcPr>
-            <w:tcW w:w="2880" w:type="dxa"/>
-          </w:tcPr>
-          <w:p>
-            <w:r>
-              <w:t>Timeline Phase</w:t>
-            </w:r>
-          </w:p>
-        </w:tc>
-        <w:tc>
-          <w:tcPr>
-            <w:tcW w:w="2880" w:type="dxa"/>
-          </w:tcPr>
-          <w:p>
-            <w:r>
-              <w:t>Main Activities</w:t>
-            </w:r>
-          </w:p>
-        </w:tc>
-        <w:tc>
-          <w:tcPr>
-            <w:tcW w:w="2880" w:type="dxa"/>
-          </w:tcPr>
-          <w:p>
-            <w:r>
-              <w:t>Operational Focus</w:t>
+              <w:t>Operational readiness</w:t>
             </w:r>
           </w:p>
         </w:tc>
@@ -665,7 +1095,7 @@
           </w:tcPr>
           <w:p>
             <w:r>
-              <w:t>90 Days Before</w:t>
+              <w:t>Event Days</w:t>
             </w:r>
           </w:p>
         </w:tc>
@@ -675,7 +1105,10 @@
           </w:tcPr>
           <w:p>
             <w:r>
-              <w:t>Sponsor outreach, venue planning</w:t>
+              <w:t>Check-in, live operations</w:t>
+            </w:r>
+            <w:r>
+              <w:t>, escalation management</w:t>
             </w:r>
           </w:p>
         </w:tc>
@@ -685,7 +1118,7 @@
           </w:tcPr>
           <w:p>
             <w:r>
-              <w:t>Strategic preparation</w:t>
+              <w:t>Execution</w:t>
             </w:r>
           </w:p>
         </w:tc>
@@ -697,7 +1130,8 @@
           </w:tcPr>
           <w:p>
             <w:r>
-              <w:t>30 Days Before</w:t>
+              <w:lastRenderedPageBreak/>
+              <w:t>Post Event</w:t>
             </w:r>
           </w:p>
         </w:tc>
@@ -707,7 +1141,16 @@
           </w:tcPr>
           <w:p>
             <w:r>
-              <w:t>Agenda finalization, volunteers</w:t>
+              <w:t>Feedback</w:t>
+            </w:r>
+            <w:r>
+              <w:t xml:space="preserve"> analysis</w:t>
+            </w:r>
+            <w:r>
+              <w:t>, reporting</w:t>
+            </w:r>
+            <w:r>
+              <w:t>, sponsor follow-up</w:t>
             </w:r>
           </w:p>
         </w:tc>
@@ -717,414 +1160,79 @@
           </w:tcPr>
           <w:p>
             <w:r>
-              <w:t>Coordination</w:t>
-            </w:r>
-          </w:p>
-        </w:tc>
-      </w:tr>
-      <w:tr>
-        <w:tc>
-          <w:tcPr>
-            <w:tcW w:w="2880" w:type="dxa"/>
-          </w:tcPr>
-          <w:p>
-            <w:r>
-              <w:t>7 Days Before</w:t>
-            </w:r>
-          </w:p>
-        </w:tc>
-        <w:tc>
-          <w:tcPr>
-            <w:tcW w:w="2880" w:type="dxa"/>
-          </w:tcPr>
-          <w:p>
-            <w:r>
-              <w:t>Testing, briefings</w:t>
-            </w:r>
-          </w:p>
-        </w:tc>
-        <w:tc>
-          <w:tcPr>
-            <w:tcW w:w="2880" w:type="dxa"/>
-          </w:tcPr>
-          <w:p>
-            <w:r>
-              <w:t>Operational readiness</w:t>
-            </w:r>
-          </w:p>
-        </w:tc>
-      </w:tr>
-      <w:tr>
-        <w:tc>
-          <w:tcPr>
-            <w:tcW w:w="2880" w:type="dxa"/>
-          </w:tcPr>
-          <w:p>
-            <w:r>
-              <w:t>Event Days</w:t>
-            </w:r>
-          </w:p>
-        </w:tc>
-        <w:tc>
-          <w:tcPr>
-            <w:tcW w:w="2880" w:type="dxa"/>
-          </w:tcPr>
-          <w:p>
-            <w:r>
-              <w:t>Check-in, live operations</w:t>
-            </w:r>
-          </w:p>
-        </w:tc>
-        <w:tc>
-          <w:tcPr>
-            <w:tcW w:w="2880" w:type="dxa"/>
-          </w:tcPr>
-          <w:p>
-            <w:r>
-              <w:t>Execution</w:t>
-            </w:r>
-          </w:p>
-        </w:tc>
-      </w:tr>
-      <w:tr>
-        <w:tc>
-          <w:tcPr>
-            <w:tcW w:w="2880" w:type="dxa"/>
-          </w:tcPr>
-          <w:p>
-            <w:r>
-              <w:t>Post Event</w:t>
-            </w:r>
-          </w:p>
-        </w:tc>
-        <w:tc>
-          <w:tcPr>
-            <w:tcW w:w="2880" w:type="dxa"/>
-          </w:tcPr>
-          <w:p>
-            <w:r>
-              <w:t>Feedback, reporting</w:t>
-            </w:r>
-          </w:p>
-        </w:tc>
-        <w:tc>
-          <w:tcPr>
-            <w:tcW w:w="2880" w:type="dxa"/>
-          </w:tcPr>
-          <w:p>
-            <w:r>
               <w:t>Evaluation</w:t>
+            </w:r>
+            <w:r>
+              <w:t xml:space="preserve"> &amp; optimization</w:t>
             </w:r>
           </w:p>
         </w:tc>
       </w:tr>
     </w:tbl>
+    <w:p/>
     <w:p>
       <w:r>
-        <w:br/>
-        <w:t>[Insert Figure 3: Event Timeline Graphic]</w:t>
+        <w:t>The operational roadmap improves execution consistency and ensures that all operational teams remain aligned across preparation, execution, and post-event evaluation activities.</w:t>
       </w:r>
       <w:r>
         <w:br/>
       </w:r>
     </w:p>
     <w:p>
-      <w:pPr>
-        <w:pStyle w:val="Heading2"/>
-      </w:pPr>
       <w:r>
-        <w:t>D. Risk Management</w:t>
+        <w:rPr>
+          <w:noProof/>
+        </w:rPr>
+        <w:drawing>
+          <wp:inline distT="0" distB="0" distL="0" distR="0" wp14:anchorId="7041FEBD" wp14:editId="611D938F">
+            <wp:extent cx="5486400" cy="3088005"/>
+            <wp:effectExtent l="0" t="0" r="0" b="0"/>
+            <wp:docPr id="403195925" name="Picture 6"/>
+            <wp:cNvGraphicFramePr>
+              <a:graphicFrameLocks xmlns:a="http://schemas.openxmlformats.org/drawingml/2006/main" noChangeAspect="1"/>
+            </wp:cNvGraphicFramePr>
+            <a:graphic xmlns:a="http://schemas.openxmlformats.org/drawingml/2006/main">
+              <a:graphicData uri="http://schemas.openxmlformats.org/drawingml/2006/picture">
+                <pic:pic xmlns:pic="http://schemas.openxmlformats.org/drawingml/2006/picture">
+                  <pic:nvPicPr>
+                    <pic:cNvPr id="403195925" name="Picture 403195925"/>
+                    <pic:cNvPicPr/>
+                  </pic:nvPicPr>
+                  <pic:blipFill>
+                    <a:blip r:embed="rId8"/>
+                    <a:stretch>
+                      <a:fillRect/>
+                    </a:stretch>
+                  </pic:blipFill>
+                  <pic:spPr>
+                    <a:xfrm>
+                      <a:off x="0" y="0"/>
+                      <a:ext cx="5486400" cy="3088005"/>
+                    </a:xfrm>
+                    <a:prstGeom prst="rect">
+                      <a:avLst/>
+                    </a:prstGeom>
+                  </pic:spPr>
+                </pic:pic>
+              </a:graphicData>
+            </a:graphic>
+          </wp:inline>
+        </w:drawing>
       </w:r>
     </w:p>
-    <w:tbl>
-      <w:tblPr>
-        <w:tblStyle w:val="TableGrid"/>
-        <w:tblW w:w="0" w:type="auto"/>
-        <w:tblLook w:val="04A0" w:firstRow="1" w:lastRow="0" w:firstColumn="1" w:lastColumn="0" w:noHBand="0" w:noVBand="1"/>
-      </w:tblPr>
-      <w:tblGrid>
-        <w:gridCol w:w="1726"/>
-        <w:gridCol w:w="1726"/>
-        <w:gridCol w:w="1725"/>
-        <w:gridCol w:w="1726"/>
-        <w:gridCol w:w="1727"/>
-      </w:tblGrid>
-      <w:tr>
-        <w:tc>
-          <w:tcPr>
-            <w:tcW w:w="1728" w:type="dxa"/>
-          </w:tcPr>
-          <w:p>
-            <w:r>
-              <w:t>Risk</w:t>
-            </w:r>
-          </w:p>
-        </w:tc>
-        <w:tc>
-          <w:tcPr>
-            <w:tcW w:w="1728" w:type="dxa"/>
-          </w:tcPr>
-          <w:p>
-            <w:r>
-              <w:t>Likelihood</w:t>
-            </w:r>
-          </w:p>
-        </w:tc>
-        <w:tc>
-          <w:tcPr>
-            <w:tcW w:w="1728" w:type="dxa"/>
-          </w:tcPr>
-          <w:p>
-            <w:r>
-              <w:t>Impact</w:t>
-            </w:r>
-          </w:p>
-        </w:tc>
-        <w:tc>
-          <w:tcPr>
-            <w:tcW w:w="1728" w:type="dxa"/>
-          </w:tcPr>
-          <w:p>
-            <w:r>
-              <w:t>Mitigation</w:t>
-            </w:r>
-          </w:p>
-        </w:tc>
-        <w:tc>
-          <w:tcPr>
-            <w:tcW w:w="1728" w:type="dxa"/>
-          </w:tcPr>
-          <w:p>
-            <w:r>
-              <w:t>Owner</w:t>
-            </w:r>
-          </w:p>
-        </w:tc>
-      </w:tr>
-      <w:tr>
-        <w:tc>
-          <w:tcPr>
-            <w:tcW w:w="1728" w:type="dxa"/>
-          </w:tcPr>
-          <w:p>
-            <w:r>
-              <w:t>Speaker cancellation</w:t>
-            </w:r>
-          </w:p>
-        </w:tc>
-        <w:tc>
-          <w:tcPr>
-            <w:tcW w:w="1728" w:type="dxa"/>
-          </w:tcPr>
-          <w:p>
-            <w:r>
-              <w:t>Medium</w:t>
-            </w:r>
-          </w:p>
-        </w:tc>
-        <w:tc>
-          <w:tcPr>
-            <w:tcW w:w="1728" w:type="dxa"/>
-          </w:tcPr>
-          <w:p>
-            <w:r>
-              <w:t>High</w:t>
-            </w:r>
-          </w:p>
-        </w:tc>
-        <w:tc>
-          <w:tcPr>
-            <w:tcW w:w="1728" w:type="dxa"/>
-          </w:tcPr>
-          <w:p>
-            <w:r>
-              <w:t>Backup speakers</w:t>
-            </w:r>
-          </w:p>
-        </w:tc>
-        <w:tc>
-          <w:tcPr>
-            <w:tcW w:w="1728" w:type="dxa"/>
-          </w:tcPr>
-          <w:p>
-            <w:r>
-              <w:t>Speaker Team</w:t>
-            </w:r>
-          </w:p>
-        </w:tc>
-      </w:tr>
-      <w:tr>
-        <w:tc>
-          <w:tcPr>
-            <w:tcW w:w="1728" w:type="dxa"/>
-          </w:tcPr>
-          <w:p>
-            <w:r>
-              <w:t>Internet failure</w:t>
-            </w:r>
-          </w:p>
-        </w:tc>
-        <w:tc>
-          <w:tcPr>
-            <w:tcW w:w="1728" w:type="dxa"/>
-          </w:tcPr>
-          <w:p>
-            <w:r>
-              <w:t>Medium</w:t>
-            </w:r>
-          </w:p>
-        </w:tc>
-        <w:tc>
-          <w:tcPr>
-            <w:tcW w:w="1728" w:type="dxa"/>
-          </w:tcPr>
-          <w:p>
-            <w:r>
-              <w:t>High</w:t>
-            </w:r>
-          </w:p>
-        </w:tc>
-        <w:tc>
-          <w:tcPr>
-            <w:tcW w:w="1728" w:type="dxa"/>
-          </w:tcPr>
-          <w:p>
-            <w:r>
-              <w:t>Backup routers</w:t>
-            </w:r>
-          </w:p>
-        </w:tc>
-        <w:tc>
-          <w:tcPr>
-            <w:tcW w:w="1728" w:type="dxa"/>
-          </w:tcPr>
-          <w:p>
-            <w:r>
-              <w:t>Tech Team</w:t>
-            </w:r>
-          </w:p>
-        </w:tc>
-      </w:tr>
-      <w:tr>
-        <w:tc>
-          <w:tcPr>
-            <w:tcW w:w="1728" w:type="dxa"/>
-          </w:tcPr>
-          <w:p>
-            <w:r>
-              <w:t>Volunteer no-shows</w:t>
-            </w:r>
-          </w:p>
-        </w:tc>
-        <w:tc>
-          <w:tcPr>
-            <w:tcW w:w="1728" w:type="dxa"/>
-          </w:tcPr>
-          <w:p>
-            <w:r>
-              <w:t>Medium</w:t>
-            </w:r>
-          </w:p>
-        </w:tc>
-        <w:tc>
-          <w:tcPr>
-            <w:tcW w:w="1728" w:type="dxa"/>
-          </w:tcPr>
-          <w:p>
-            <w:r>
-              <w:t>Medium</w:t>
-            </w:r>
-          </w:p>
-        </w:tc>
-        <w:tc>
-          <w:tcPr>
-            <w:tcW w:w="1728" w:type="dxa"/>
-          </w:tcPr>
-          <w:p>
-            <w:r>
-              <w:t>Reserve volunteers</w:t>
-            </w:r>
-          </w:p>
-        </w:tc>
-        <w:tc>
-          <w:tcPr>
-            <w:tcW w:w="1728" w:type="dxa"/>
-          </w:tcPr>
-          <w:p>
-            <w:r>
-              <w:t>Operations Team</w:t>
-            </w:r>
-          </w:p>
-        </w:tc>
-      </w:tr>
-      <w:tr>
-        <w:tc>
-          <w:tcPr>
-            <w:tcW w:w="1728" w:type="dxa"/>
-          </w:tcPr>
-          <w:p>
-            <w:r>
-              <w:t>Registration overload</w:t>
-            </w:r>
-          </w:p>
-        </w:tc>
-        <w:tc>
-          <w:tcPr>
-            <w:tcW w:w="1728" w:type="dxa"/>
-          </w:tcPr>
-          <w:p>
-            <w:r>
-              <w:t>High</w:t>
-            </w:r>
-          </w:p>
-        </w:tc>
-        <w:tc>
-          <w:tcPr>
-            <w:tcW w:w="1728" w:type="dxa"/>
-          </w:tcPr>
-          <w:p>
-            <w:r>
-              <w:t>High</w:t>
-            </w:r>
-          </w:p>
-        </w:tc>
-        <w:tc>
-          <w:tcPr>
-            <w:tcW w:w="1728" w:type="dxa"/>
-          </w:tcPr>
-          <w:p>
-            <w:r>
-              <w:t>Extra check-in desks</w:t>
-            </w:r>
-          </w:p>
-        </w:tc>
-        <w:tc>
-          <w:tcPr>
-            <w:tcW w:w="1728" w:type="dxa"/>
-          </w:tcPr>
-          <w:p>
-            <w:r>
-              <w:t>Registration Team</w:t>
-            </w:r>
-          </w:p>
-        </w:tc>
-      </w:tr>
-    </w:tbl>
-    <w:p>
-      <w:r>
-        <w:br/>
-        <w:t>[Insert Figure 4: Operational Risk Matrix]</w:t>
-      </w:r>
-      <w:r>
-        <w:br/>
-      </w:r>
-    </w:p>
-    <w:p/>
-    <w:p/>
     <w:p>
       <w:pPr>
         <w:pStyle w:val="Heading1"/>
       </w:pPr>
+      <w:r>
+        <w:t xml:space="preserve">Part </w:t>
+      </w:r>
+      <w:r>
+        <w:t>2</w:t>
+      </w:r>
+      <w:r>
+        <w:t xml:space="preserve"> - </w:t>
+      </w:r>
       <w:r>
         <w:t>AI-Enhanced Hackathon Coordination Workflow</w:t>
       </w:r>
@@ -1139,21 +1247,7 @@
         <w:rPr>
           <w:lang w:val="en-GB"/>
         </w:rPr>
-        <w:t xml:space="preserve">The AI-Enhanced Hackathon Coordination Workflow was designed to support efficient operational management for the </w:t>
-      </w:r>
-      <w:proofErr w:type="spellStart"/>
-      <w:r>
-        <w:rPr>
-          <w:lang w:val="en-GB"/>
-        </w:rPr>
-        <w:t>MunichTech</w:t>
-      </w:r>
-      <w:proofErr w:type="spellEnd"/>
-      <w:r>
-        <w:rPr>
-          <w:lang w:val="en-GB"/>
-        </w:rPr>
-        <w:t xml:space="preserve"> EXPO 2026 hackathon environment. The workflow combines structured event coordination processes with AI-supported automation features to improve onboarding, communication, execution monitoring, and evaluation activities throughout the hackathon lifecycle.</w:t>
+        <w:t>The AI-Enhanced Hackathon Coordination Workflow was designed to support efficient operational management for the MunichTech EXPO 2026 hackathon environment. The workflow combines structured event coordination processes with AI-supported automation features to improve onboarding, communication, execution monitoring, and evaluation activities throughout the hackathon lifecycle.</w:t>
       </w:r>
     </w:p>
     <w:p>
@@ -1178,14 +1272,7 @@
         <w:rPr>
           <w:lang w:val="en-GB"/>
         </w:rPr>
-        <w:t xml:space="preserve">During the onboarding phase, participants complete registration and provide information regarding their technical skills, interests, and preferred challenge areas. AI-supported </w:t>
-      </w:r>
-      <w:r>
-        <w:rPr>
-          <w:lang w:val="en-GB"/>
-        </w:rPr>
-        <w:lastRenderedPageBreak/>
-        <w:t>profile analysis assists organizers in understanding participant capabilities, while AI team-matching systems help create balanced and collaborative teams based on skills and interests. Once teams are formed, challenge assignments are distributed according to sponsor categories and hackathon objectives.</w:t>
+        <w:t>During the onboarding phase, participants complete registration and provide information regarding their technical skills, interests, and preferred challenge areas. AI-supported profile analysis assists organizers in understanding participant capabilities, while AI team-matching systems help create balanced and collaborative teams based on skills and interests. Once teams are formed, challenge assignments are distributed according to sponsor categories and hackathon objectives.</w:t>
       </w:r>
     </w:p>
     <w:p>
@@ -1198,6 +1285,7 @@
         <w:rPr>
           <w:lang w:val="en-GB"/>
         </w:rPr>
+        <w:lastRenderedPageBreak/>
         <w:t>The execution phase focuses on operational coordination and participant support throughout the hackathon. Mentor coordination ensures that each team receives guidance and technical support during development activities. Progress checkpoints allow organizers to monitor team advancement and identify operational bottlenecks early. AI-supported monitoring tools help track participation activity, submission readiness, and engagement levels during the execution process. Submission collection and validation processes also help ensure that all project submissions follow the required hackathon guidelines and deadlines.</w:t>
       </w:r>
     </w:p>
@@ -1211,21 +1299,7 @@
         <w:rPr>
           <w:lang w:val="en-GB"/>
         </w:rPr>
-        <w:t xml:space="preserve">The evaluation phase supports judging coordination, score aggregation, winner selection, and participant feedback collection. AI-generated score summarization assists judges by organizing evaluation results efficiently across multiple teams and categories. AI-supported sentiment analysis also helps organizers </w:t>
-      </w:r>
-      <w:proofErr w:type="spellStart"/>
-      <w:r>
-        <w:rPr>
-          <w:lang w:val="en-GB"/>
-        </w:rPr>
-        <w:t>analyze</w:t>
-      </w:r>
-      <w:proofErr w:type="spellEnd"/>
-      <w:r>
-        <w:rPr>
-          <w:lang w:val="en-GB"/>
-        </w:rPr>
-        <w:t xml:space="preserve"> participant feedback and overall hackathon engagement after the event.</w:t>
+        <w:t>The evaluation phase supports judging coordination, score aggregation, winner selection, and participant feedback collection. AI-generated score summarization assists judges by organizing evaluation results efficiently across multiple teams and categories. AI-supported sentiment analysis also helps organizers analyze participant feedback and overall hackathon engagement after the event.</w:t>
       </w:r>
     </w:p>
     <w:p>
@@ -1238,21 +1312,7 @@
         <w:rPr>
           <w:lang w:val="en-GB"/>
         </w:rPr>
-        <w:t xml:space="preserve">The overall workflow improves operational scalability, coordination efficiency, and communication management for high-participant event environments. By integrating AI-supported systems into the coordination process, </w:t>
-      </w:r>
-      <w:proofErr w:type="spellStart"/>
-      <w:r>
-        <w:rPr>
-          <w:lang w:val="en-GB"/>
-        </w:rPr>
-        <w:t>MunichTech</w:t>
-      </w:r>
-      <w:proofErr w:type="spellEnd"/>
-      <w:r>
-        <w:rPr>
-          <w:lang w:val="en-GB"/>
-        </w:rPr>
-        <w:t xml:space="preserve"> EXPO 2026 can reduce operational bottlenecks, improve decision-making visibility, and support a more organized and scalable hackathon experience for participants, mentors, sponsors, and event organizers.</w:t>
+        <w:t>The overall workflow improves operational scalability, coordination efficiency, and communication management for high-participant event environments. By integrating AI-supported systems into the coordination process, MunichTech EXPO 2026 can reduce operational bottlenecks, improve decision-making visibility, and support a more organized and scalable hackathon experience for participants, mentors, sponsors, and event organizers.</w:t>
       </w:r>
     </w:p>
     <w:p>
@@ -1282,7 +1342,7 @@
                     <pic:cNvPicPr/>
                   </pic:nvPicPr>
                   <pic:blipFill>
-                    <a:blip r:embed="rId6"/>
+                    <a:blip r:embed="rId9"/>
                     <a:stretch>
                       <a:fillRect/>
                     </a:stretch>
@@ -1308,21 +1368,19 @@
         <w:pStyle w:val="Heading1"/>
       </w:pPr>
       <w:r>
-        <w:lastRenderedPageBreak/>
+        <w:t xml:space="preserve">Part 3 - </w:t>
+      </w:r>
+      <w:r>
         <w:t>AI-Supported Workflow Automations</w:t>
       </w:r>
     </w:p>
     <w:p>
       <w:r>
-        <w:t xml:space="preserve">The </w:t>
+        <w:t xml:space="preserve">The MunichTech EXPO 2026 operational framework integrates AI-supported workflow automations to improve coordination efficiency, reduce operational bottlenecks, and support scalable event execution. These automations are designed to enhance </w:t>
       </w:r>
-      <w:proofErr w:type="spellStart"/>
       <w:r>
-        <w:t>MunichTech</w:t>
-      </w:r>
-      <w:proofErr w:type="spellEnd"/>
-      <w:r>
-        <w:t xml:space="preserve"> EXPO 2026 operational framework integrates AI-supported workflow automations to improve coordination efficiency, reduce operational bottlenecks, and support scalable event execution. These automations are designed to enhance communication, monitoring, reporting, participant coordination, and operational decision-making across multiple event activities.</w:t>
+        <w:lastRenderedPageBreak/>
+        <w:t>communication, monitoring, reporting, participant coordination, and operational decision-making across multiple event activities.</w:t>
       </w:r>
     </w:p>
     <w:p>
@@ -1744,7 +1802,6 @@
           </w:tcPr>
           <w:p>
             <w:r>
-              <w:lastRenderedPageBreak/>
               <w:t>AI Operational Summary Generation</w:t>
             </w:r>
           </w:p>
@@ -1839,7 +1896,14 @@
                     <w:rPr>
                       <w:lang w:val="en-GB"/>
                     </w:rPr>
-                    <w:t>Manual reporting and operational summarization consume significant coordination time after event activities.</w:t>
+                    <w:t xml:space="preserve">Manual reporting and operational summarization consume significant </w:t>
+                  </w:r>
+                  <w:r>
+                    <w:rPr>
+                      <w:lang w:val="en-GB"/>
+                    </w:rPr>
+                    <w:lastRenderedPageBreak/>
+                    <w:t>coordination time after event activities.</w:t>
                   </w:r>
                 </w:p>
               </w:tc>
@@ -1859,6 +1923,7 @@
           </w:tcPr>
           <w:p>
             <w:r>
+              <w:lastRenderedPageBreak/>
               <w:t>AI-generated summaries compile dashboard insights, incident logs, operational updates, and event performance metrics automatically.</w:t>
             </w:r>
           </w:p>
@@ -2093,11 +2158,7 @@
           </w:tcPr>
           <w:p>
             <w:r>
-              <w:t xml:space="preserve">Operational systems automatically generate sponsor engagement reports using attendance metrics, networking </w:t>
-            </w:r>
-            <w:r>
-              <w:lastRenderedPageBreak/>
-              <w:t>activity, and booth interaction data.</w:t>
+              <w:t>Operational systems automatically generate sponsor engagement reports using attendance metrics, networking activity, and booth interaction data.</w:t>
             </w:r>
           </w:p>
         </w:tc>
@@ -2125,7 +2186,11 @@
           </w:tcPr>
           <w:p>
             <w:r>
-              <w:t>Important operational deadlines may be missed across multiple event coordination activities.</w:t>
+              <w:t xml:space="preserve">Important operational deadlines may be missed across </w:t>
+            </w:r>
+            <w:r>
+              <w:lastRenderedPageBreak/>
+              <w:t>multiple event coordination activities.</w:t>
             </w:r>
           </w:p>
         </w:tc>
@@ -2135,7 +2200,12 @@
           </w:tcPr>
           <w:p>
             <w:r>
-              <w:t>Monitoring systems track operational milestones and automatically notify coordination teams about upcoming deadlines and pending tasks.</w:t>
+              <w:lastRenderedPageBreak/>
+              <w:t xml:space="preserve">Monitoring systems track operational milestones and automatically notify </w:t>
+            </w:r>
+            <w:r>
+              <w:lastRenderedPageBreak/>
+              <w:t>coordination teams about upcoming deadlines and pending tasks.</w:t>
             </w:r>
           </w:p>
         </w:tc>
@@ -2145,14 +2215,59 @@
           </w:tcPr>
           <w:p>
             <w:r>
-              <w:t>Improved operational execution consistency and reduced coordination delays.</w:t>
+              <w:lastRenderedPageBreak/>
+              <w:t xml:space="preserve">Improved operational execution consistency and </w:t>
+            </w:r>
+            <w:r>
+              <w:lastRenderedPageBreak/>
+              <w:t>reduced coordination delays.</w:t>
             </w:r>
           </w:p>
         </w:tc>
       </w:tr>
     </w:tbl>
     <w:p/>
-    <w:p/>
+    <w:p>
+      <w:pPr>
+        <w:pStyle w:val="Heading2"/>
+      </w:pPr>
+      <w:r>
+        <w:t>Operational Impact of AI Integration</w:t>
+      </w:r>
+    </w:p>
+    <w:p>
+      <w:pPr>
+        <w:rPr>
+          <w:lang w:val="en-GB"/>
+        </w:rPr>
+      </w:pPr>
+      <w:r>
+        <w:rPr>
+          <w:lang w:val="en-GB"/>
+        </w:rPr>
+        <w:t>The integration of AI-supported workflow automations within MunichTech EXPO 2026 improves operational scalability, communication efficiency, monitoring visibility, and execution consistency across the event lifecycle. By automating repetitive coordination processes and enhancing operational intelligence, the event structure becomes more responsive, organized, and scalable for participants, sponsors, speakers, volunteers, exhibitors, and operational teams.</w:t>
+      </w:r>
+    </w:p>
+    <w:p>
+      <w:pPr>
+        <w:rPr>
+          <w:lang w:val="en-GB"/>
+        </w:rPr>
+      </w:pPr>
+      <w:r>
+        <w:rPr>
+          <w:lang w:val="en-GB"/>
+        </w:rPr>
+        <w:t>AI-supported monitoring systems, automated communication workflows, and centralized coordination processes also improve operational responsiveness during high-pressure event scenarios. These systems help reduce coordination bottlenecks, support faster operational decision-making, and strengthen overall event execution capabilities across multiple operational environments during MunichTech EXPO 2026.</w:t>
+      </w:r>
+    </w:p>
+    <w:p>
+      <w:pPr>
+        <w:rPr>
+          <w:lang w:val="en-GB"/>
+        </w:rPr>
+      </w:pPr>
+    </w:p>
     <w:p>
       <w:pPr>
         <w:pStyle w:val="Heading1"/>
@@ -2163,15 +2278,7 @@
     </w:p>
     <w:p>
       <w:r>
-        <w:t xml:space="preserve">Effective event operations require proactive risk identification, escalation planning, and operational stabilization strategies. The </w:t>
-      </w:r>
-      <w:proofErr w:type="spellStart"/>
-      <w:r>
-        <w:t>MunichTech</w:t>
-      </w:r>
-      <w:proofErr w:type="spellEnd"/>
-      <w:r>
-        <w:t xml:space="preserve"> EXPO 2026 operational framework integrates structured risk management processes to reduce operational disruptions, improve response coordination, and support scalable event execution across multiple operational areas.</w:t>
+        <w:t>Effective event operations require proactive risk identification, escalation planning, and operational stabilization strategies. The MunichTech EXPO 2026 operational framework integrates structured risk management processes to reduce operational disruptions, improve response coordination, and support scalable event execution across multiple operational areas.</w:t>
       </w:r>
     </w:p>
     <w:p>
@@ -2791,6 +2898,7 @@
           </w:tcPr>
           <w:p>
             <w:r>
+              <w:lastRenderedPageBreak/>
               <w:t>Communication Delays Between Teams</w:t>
             </w:r>
           </w:p>
@@ -3017,28 +3125,60 @@
     </w:tbl>
     <w:p/>
     <w:p>
+      <w:r>
+        <w:rPr>
+          <w:noProof/>
+        </w:rPr>
+        <w:drawing>
+          <wp:inline distT="0" distB="0" distL="0" distR="0" wp14:anchorId="63762A56" wp14:editId="4DA2EA3F">
+            <wp:extent cx="5486400" cy="3657600"/>
+            <wp:effectExtent l="0" t="0" r="0" b="0"/>
+            <wp:docPr id="1922450099" name="Picture 7"/>
+            <wp:cNvGraphicFramePr>
+              <a:graphicFrameLocks xmlns:a="http://schemas.openxmlformats.org/drawingml/2006/main" noChangeAspect="1"/>
+            </wp:cNvGraphicFramePr>
+            <a:graphic xmlns:a="http://schemas.openxmlformats.org/drawingml/2006/main">
+              <a:graphicData uri="http://schemas.openxmlformats.org/drawingml/2006/picture">
+                <pic:pic xmlns:pic="http://schemas.openxmlformats.org/drawingml/2006/picture">
+                  <pic:nvPicPr>
+                    <pic:cNvPr id="1922450099" name="Picture 1922450099"/>
+                    <pic:cNvPicPr/>
+                  </pic:nvPicPr>
+                  <pic:blipFill>
+                    <a:blip r:embed="rId10"/>
+                    <a:stretch>
+                      <a:fillRect/>
+                    </a:stretch>
+                  </pic:blipFill>
+                  <pic:spPr>
+                    <a:xfrm>
+                      <a:off x="0" y="0"/>
+                      <a:ext cx="5486400" cy="3657600"/>
+                    </a:xfrm>
+                    <a:prstGeom prst="rect">
+                      <a:avLst/>
+                    </a:prstGeom>
+                  </pic:spPr>
+                </pic:pic>
+              </a:graphicData>
+            </a:graphic>
+          </wp:inline>
+        </w:drawing>
+      </w:r>
+    </w:p>
+    <w:p>
       <w:pPr>
         <w:pStyle w:val="Heading2"/>
       </w:pPr>
       <w:r>
-        <w:lastRenderedPageBreak/>
         <w:t>Operational Stabilization Approach</w:t>
       </w:r>
     </w:p>
     <w:p>
       <w:r>
-        <w:t xml:space="preserve">The </w:t>
-      </w:r>
-      <w:proofErr w:type="spellStart"/>
-      <w:r>
-        <w:t>MunichTech</w:t>
-      </w:r>
-      <w:proofErr w:type="spellEnd"/>
-      <w:r>
-        <w:t xml:space="preserve"> EXPO 2026 operational framework integrates escalation monitoring, centralized communication systems, AI-supported risk alerts, and rapid response coordination processes to stabilize operational activities during high-pressure event scenarios. Structured escalation workflows and operational monitoring systems improve visibility, reduce response delays, and support continuity across attendee, sponsor, speaker, and hackathon operations.</w:t>
+        <w:t>The MunichTech EXPO 2026 operational framework integrates escalation monitoring, centralized communication systems, AI-supported risk alerts, and rapid response coordination processes to stabilize operational activities during high-pressure event scenarios. Structured escalation workflows and operational monitoring systems improve visibility, reduce response delays, and support continuity across attendee, sponsor, speaker, and hackathon operations.</w:t>
       </w:r>
     </w:p>
-    <w:p/>
     <w:p>
       <w:pPr>
         <w:pStyle w:val="Heading1"/>
@@ -3049,15 +3189,7 @@
     </w:p>
     <w:p>
       <w:r>
-        <w:t xml:space="preserve">Effective communication and coordination processes are essential for maintaining operational alignment during large-scale event execution. The </w:t>
-      </w:r>
-      <w:proofErr w:type="spellStart"/>
-      <w:r>
-        <w:t>MunichTech</w:t>
-      </w:r>
-      <w:proofErr w:type="spellEnd"/>
-      <w:r>
-        <w:t xml:space="preserve"> EXPO 2026 operational framework integrates structured communication channels, stakeholder coordination processes, and AI-supported communication systems to improve responsiveness, visibility, and execution consistency across operational teams, sponsors, exhibitors, speakers, volunteers, and attendees.</w:t>
+        <w:t>Effective communication and coordination processes are essential for maintaining operational alignment during large-scale event execution. The MunichTech EXPO 2026 operational framework integrates structured communication channels, stakeholder coordination processes, and AI-supported communication systems to improve responsiveness, visibility, and execution consistency across operational teams, sponsors, exhibitors, speakers, volunteers, and attendees.</w:t>
       </w:r>
     </w:p>
     <w:p>
@@ -3065,6 +3197,7 @@
         <w:pStyle w:val="Heading2"/>
       </w:pPr>
       <w:r>
+        <w:lastRenderedPageBreak/>
         <w:t>Sponsor Communication</w:t>
       </w:r>
     </w:p>
@@ -3099,21 +3232,7 @@
         <w:rPr>
           <w:lang w:val="en-GB"/>
         </w:rPr>
-        <w:t xml:space="preserve"> </w:t>
-      </w:r>
-      <w:proofErr w:type="spellStart"/>
-      <w:r>
-        <w:rPr>
-          <w:lang w:val="en-GB"/>
-        </w:rPr>
-        <w:t>MunichTech</w:t>
-      </w:r>
-      <w:proofErr w:type="spellEnd"/>
-      <w:r>
-        <w:rPr>
-          <w:lang w:val="en-GB"/>
-        </w:rPr>
-        <w:t xml:space="preserve"> EXPO 2026 – Sponsor Coordination Follow-Up</w:t>
+        <w:t xml:space="preserve"> MunichTech EXPO 2026 – Sponsor Coordination Follow-Up</w:t>
       </w:r>
     </w:p>
     <w:p>
@@ -3147,25 +3266,7 @@
           <w:iCs/>
           <w:lang w:val="en-GB"/>
         </w:rPr>
-        <w:t xml:space="preserve">Thank you once again for your partnership and support for </w:t>
-      </w:r>
-      <w:proofErr w:type="spellStart"/>
-      <w:r>
-        <w:rPr>
-          <w:i/>
-          <w:iCs/>
-          <w:lang w:val="en-GB"/>
-        </w:rPr>
-        <w:t>MunichTech</w:t>
-      </w:r>
-      <w:proofErr w:type="spellEnd"/>
-      <w:r>
-        <w:rPr>
-          <w:i/>
-          <w:iCs/>
-          <w:lang w:val="en-GB"/>
-        </w:rPr>
-        <w:t xml:space="preserve"> EXPO 2026.</w:t>
+        <w:t>Thank you once again for your partnership and support for MunichTech EXPO 2026.</w:t>
       </w:r>
     </w:p>
     <w:p>
@@ -3215,25 +3316,7 @@
           <w:iCs/>
           <w:lang w:val="en-GB"/>
         </w:rPr>
-        <w:t xml:space="preserve">We appreciate your collaboration and look forward to working together to deliver a successful </w:t>
-      </w:r>
-      <w:proofErr w:type="spellStart"/>
-      <w:r>
-        <w:rPr>
-          <w:i/>
-          <w:iCs/>
-          <w:lang w:val="en-GB"/>
-        </w:rPr>
-        <w:t>MunichTech</w:t>
-      </w:r>
-      <w:proofErr w:type="spellEnd"/>
-      <w:r>
-        <w:rPr>
-          <w:i/>
-          <w:iCs/>
-          <w:lang w:val="en-GB"/>
-        </w:rPr>
-        <w:t xml:space="preserve"> EXPO 2026 experience.</w:t>
+        <w:t>We appreciate your collaboration and look forward to working together to deliver a successful MunichTech EXPO 2026 experience.</w:t>
       </w:r>
     </w:p>
     <w:p>
@@ -3259,24 +3342,7 @@
           <w:lang w:val="en-GB"/>
         </w:rPr>
         <w:br/>
-      </w:r>
-      <w:proofErr w:type="spellStart"/>
-      <w:r>
-        <w:rPr>
-          <w:i/>
-          <w:iCs/>
-          <w:lang w:val="en-GB"/>
-        </w:rPr>
-        <w:t>MunichTech</w:t>
-      </w:r>
-      <w:proofErr w:type="spellEnd"/>
-      <w:r>
-        <w:rPr>
-          <w:i/>
-          <w:iCs/>
-          <w:lang w:val="en-GB"/>
-        </w:rPr>
-        <w:t xml:space="preserve"> EXPO Operations Team</w:t>
+        <w:t>MunichTech EXPO Operations Team</w:t>
       </w:r>
     </w:p>
     <w:p>
@@ -3284,7 +3350,6 @@
         <w:pStyle w:val="Heading2"/>
       </w:pPr>
       <w:r>
-        <w:lastRenderedPageBreak/>
         <w:t>Exhibitor Coordination</w:t>
       </w:r>
     </w:p>
@@ -3325,25 +3390,7 @@
           <w:iCs/>
           <w:lang w:val="en-GB"/>
         </w:rPr>
-        <w:t xml:space="preserve"> </w:t>
-      </w:r>
-      <w:proofErr w:type="spellStart"/>
-      <w:r>
-        <w:rPr>
-          <w:i/>
-          <w:iCs/>
-          <w:lang w:val="en-GB"/>
-        </w:rPr>
-        <w:t>MunichTech</w:t>
-      </w:r>
-      <w:proofErr w:type="spellEnd"/>
-      <w:r>
-        <w:rPr>
-          <w:i/>
-          <w:iCs/>
-          <w:lang w:val="en-GB"/>
-        </w:rPr>
-        <w:t xml:space="preserve"> EXPO 2026 – Exhibitor Onboarding &amp; Operational Information</w:t>
+        <w:t xml:space="preserve"> MunichTech EXPO 2026 – Exhibitor Onboarding &amp; Operational Information</w:t>
       </w:r>
     </w:p>
     <w:p>
@@ -3377,25 +3424,7 @@
           <w:iCs/>
           <w:lang w:val="en-GB"/>
         </w:rPr>
-        <w:t xml:space="preserve">Welcome to </w:t>
-      </w:r>
-      <w:proofErr w:type="spellStart"/>
-      <w:r>
-        <w:rPr>
-          <w:i/>
-          <w:iCs/>
-          <w:lang w:val="en-GB"/>
-        </w:rPr>
-        <w:t>MunichTech</w:t>
-      </w:r>
-      <w:proofErr w:type="spellEnd"/>
-      <w:r>
-        <w:rPr>
-          <w:i/>
-          <w:iCs/>
-          <w:lang w:val="en-GB"/>
-        </w:rPr>
-        <w:t xml:space="preserve"> EXPO 2026, and thank you for joining our exhibitor ecosystem.</w:t>
+        <w:t>Welcome to MunichTech EXPO 2026, and thank you for joining our exhibitor ecosystem.</w:t>
       </w:r>
     </w:p>
     <w:p>
@@ -3446,6 +3475,7 @@
           <w:iCs/>
           <w:lang w:val="en-GB"/>
         </w:rPr>
+        <w:lastRenderedPageBreak/>
         <w:t>Please do not hesitate to contact us for any operational assistance or clarification.</w:t>
       </w:r>
     </w:p>
@@ -3472,24 +3502,7 @@
           <w:lang w:val="en-GB"/>
         </w:rPr>
         <w:br/>
-      </w:r>
-      <w:proofErr w:type="spellStart"/>
-      <w:r>
-        <w:rPr>
-          <w:i/>
-          <w:iCs/>
-          <w:lang w:val="en-GB"/>
-        </w:rPr>
-        <w:t>MunichTech</w:t>
-      </w:r>
-      <w:proofErr w:type="spellEnd"/>
-      <w:r>
-        <w:rPr>
-          <w:i/>
-          <w:iCs/>
-          <w:lang w:val="en-GB"/>
-        </w:rPr>
-        <w:t xml:space="preserve"> EXPO Operations Team</w:t>
+        <w:t>MunichTech EXPO Operations Team</w:t>
       </w:r>
     </w:p>
     <w:p>
@@ -3528,21 +3541,7 @@
         <w:rPr>
           <w:lang w:val="en-GB"/>
         </w:rPr>
-        <w:t xml:space="preserve"> </w:t>
-      </w:r>
-      <w:proofErr w:type="spellStart"/>
-      <w:r>
-        <w:rPr>
-          <w:lang w:val="en-GB"/>
-        </w:rPr>
-        <w:t>MunichTech</w:t>
-      </w:r>
-      <w:proofErr w:type="spellEnd"/>
-      <w:r>
-        <w:rPr>
-          <w:lang w:val="en-GB"/>
-        </w:rPr>
-        <w:t xml:space="preserve"> EXPO 2026 – Operational Coordination Update</w:t>
+        <w:t xml:space="preserve"> MunichTech EXPO 2026 – Operational Coordination Update</w:t>
       </w:r>
     </w:p>
     <w:p>
@@ -3627,7 +3626,6 @@
           <w:iCs/>
           <w:lang w:val="en-GB"/>
         </w:rPr>
-        <w:lastRenderedPageBreak/>
         <w:t>Thank you all for your continued collaboration and support.</w:t>
       </w:r>
     </w:p>
@@ -3639,23 +3637,13 @@
           <w:lang w:val="en-GB"/>
         </w:rPr>
       </w:pPr>
-      <w:proofErr w:type="spellStart"/>
       <w:r>
         <w:rPr>
           <w:i/>
           <w:iCs/>
           <w:lang w:val="en-GB"/>
         </w:rPr>
-        <w:t>MunichTech</w:t>
-      </w:r>
-      <w:proofErr w:type="spellEnd"/>
-      <w:r>
-        <w:rPr>
-          <w:i/>
-          <w:iCs/>
-          <w:lang w:val="en-GB"/>
-        </w:rPr>
-        <w:t xml:space="preserve"> EXPO Operations Coordination Team</w:t>
+        <w:t>MunichTech EXPO Operations Coordination Team</w:t>
       </w:r>
     </w:p>
     <w:p/>
@@ -3669,15 +3657,7 @@
     </w:p>
     <w:p>
       <w:r>
-        <w:t xml:space="preserve">AI-supported communication systems improve operational responsiveness through automated reminders, intelligent notification systems, centralized coordination alerts, and AI-generated operational summaries. These systems help reduce communication delays, improve stakeholder visibility, and support scalable event coordination across multiple operational environments during </w:t>
-      </w:r>
-      <w:proofErr w:type="spellStart"/>
-      <w:r>
-        <w:t>MunichTech</w:t>
-      </w:r>
-      <w:proofErr w:type="spellEnd"/>
-      <w:r>
-        <w:t xml:space="preserve"> EXPO 2026.</w:t>
+        <w:t>AI-supported communication systems improve operational responsiveness through automated reminders, intelligent notification systems, centralized coordination alerts, and AI-generated operational summaries. These systems help reduce communication delays, improve stakeholder visibility, and support scalable event coordination across multiple operational environments during MunichTech EXPO 2026.</w:t>
       </w:r>
     </w:p>
     <w:p/>
@@ -3687,6 +3667,111 @@
           <w:lang w:val="en-GB"/>
         </w:rPr>
       </w:pPr>
+    </w:p>
+    <w:p>
+      <w:pPr>
+        <w:pStyle w:val="Heading1"/>
+      </w:pPr>
+      <w:r>
+        <w:lastRenderedPageBreak/>
+        <w:t>Problem Solving &amp; Operational Stabilization Scenario</w:t>
+      </w:r>
+    </w:p>
+    <w:p>
+      <w:r>
+        <w:t>Large-scale event environments require rapid decision-making, operational prioritization, and coordinated stabilization strategies during high-pressure situations. The MunichTech EXPO 2026 operational framework integrates escalation management processes, centralized communication systems, and AI-supported operational monitoring to improve responsiveness and maintain operational continuity during unexpected event disruptions.</w:t>
+      </w:r>
+    </w:p>
+    <w:p>
+      <w:pPr>
+        <w:pStyle w:val="Heading2"/>
+      </w:pPr>
+      <w:r>
+        <w:t>Immediate Operational Priorities</w:t>
+      </w:r>
+    </w:p>
+    <w:p>
+      <w:r>
+        <w:t>The first operational priority would focus on stabilizing critical event activities with the highest impact on attendee experience, sponsor visibility, and operational continuity. Speaker cancellations would require immediate identification of backup speakers, schedule adjustments, and attendee communication updates. Simultaneously, the sponsor branding issue would be escalated to the sponsor coordination and design teams to prevent activation delays during the event.</w:t>
+      </w:r>
+    </w:p>
+    <w:p>
+      <w:r>
+        <w:t>The sudden 40% increase in attendee registrations would require rapid capacity monitoring, additional check-in support, and attendee flow management to reduce overcrowding risks. Volunteer coordination breakdowns would also require immediate staffing reassignment, centralized communication updates, and operational leadership intervention to stabilize on-site coordination activities.</w:t>
+      </w:r>
+    </w:p>
+    <w:p>
+      <w:pPr>
+        <w:pStyle w:val="Heading2"/>
+      </w:pPr>
+      <w:r>
+        <w:t>Communication Approach</w:t>
+      </w:r>
+    </w:p>
+    <w:p>
+      <w:r>
+        <w:t>The communication approach would prioritize centralized coordination and rapid visibility across all operational teams. Internal communication channels would be used to provide real-time operational updates regarding speaker replacements, staffing adjustments, registration capacity monitoring, and sponsor escalation activities.</w:t>
+      </w:r>
+    </w:p>
+    <w:p>
+      <w:r>
+        <w:t>Attendees would receive updated schedules and operational notifications through email updates, event applications, and centralized communication systems. Sponsors and exhibitors would also receive direct coordination updates to maintain transparency and operational alignment during the stabilization process.</w:t>
+      </w:r>
+    </w:p>
+    <w:p>
+      <w:pPr>
+        <w:pStyle w:val="Heading2"/>
+      </w:pPr>
+      <w:r>
+        <w:t>Execution Structure</w:t>
+      </w:r>
+    </w:p>
+    <w:p>
+      <w:r>
+        <w:t>The operational execution structure would follow a centralized coordination model supported by the AI Operations Command Center. Dedicated operational teams would be assigned to specific stabilization areas, including attendee management, sponsor coordination, volunteer coordination, technical support, and speaker management.</w:t>
+      </w:r>
+    </w:p>
+    <w:p>
+      <w:r>
+        <w:t>Escalation priorities would be monitored continuously through operational dashboards and AI-supported alert systems. Regular coordination checkpoints would help ensure visibility across all operational units while improving response speed and execution consistency during live event activities.</w:t>
+      </w:r>
+    </w:p>
+    <w:p>
+      <w:pPr>
+        <w:pStyle w:val="Heading2"/>
+      </w:pPr>
+      <w:r>
+        <w:lastRenderedPageBreak/>
+        <w:t>Operational Stabilization Strategy</w:t>
+      </w:r>
+    </w:p>
+    <w:p>
+      <w:r>
+        <w:t>Operational stabilization activities would focus on reducing disruption impact while maintaining continuity across event operations. Backup operational resources, flexible scheduling adjustments, and centralized escalation management processes would support operational recovery during high-pressure situations.</w:t>
+      </w:r>
+    </w:p>
+    <w:p>
+      <w:r>
+        <w:t>Additional volunteer support and temporary staffing redistribution would help stabilize attendee coordination activities. Registration flow management systems would also be adjusted dynamically to support increased attendee capacity while minimizing congestion during check-in and networking activities.</w:t>
+      </w:r>
+    </w:p>
+    <w:p>
+      <w:pPr>
+        <w:pStyle w:val="Heading2"/>
+      </w:pPr>
+      <w:r>
+        <w:t>AI-Supported Response Coordination</w:t>
+      </w:r>
+    </w:p>
+    <w:p>
+      <w:r>
+        <w:t>AI-supported operational systems would improve stabilization visibility by monitoring operational alerts, identifying escalation priorities, and generating real-time coordination summaries for operational leadership teams. AI-supported communication systems would also assist with attendee notifications, sponsor coordination updates, and incident monitoring activities during the event.</w:t>
+      </w:r>
+    </w:p>
+    <w:p>
+      <w:r>
+        <w:t>The integration of AI-supported monitoring and escalation systems improves operational responsiveness, reduces coordination delays, and supports scalable event stabilization across multiple operational environments during MunichTech EXPO 2026.</w:t>
+      </w:r>
     </w:p>
     <w:p/>
     <w:sectPr>
@@ -3872,6 +3957,95 @@
       </w:rPr>
     </w:lvl>
   </w:abstractNum>
+  <w:abstractNum w:abstractNumId="9" w15:restartNumberingAfterBreak="0">
+    <w:nsid w:val="40EC6E3C"/>
+    <w:multiLevelType w:val="hybridMultilevel"/>
+    <w:tmpl w:val="7E365F26"/>
+    <w:lvl w:ilvl="0" w:tplc="08090015">
+      <w:start w:val="1"/>
+      <w:numFmt w:val="upperLetter"/>
+      <w:lvlText w:val="%1."/>
+      <w:lvlJc w:val="left"/>
+      <w:pPr>
+        <w:ind w:left="720" w:hanging="360"/>
+      </w:pPr>
+      <w:rPr>
+        <w:rFonts w:hint="default"/>
+      </w:rPr>
+    </w:lvl>
+    <w:lvl w:ilvl="1" w:tplc="08090019" w:tentative="1">
+      <w:start w:val="1"/>
+      <w:numFmt w:val="lowerLetter"/>
+      <w:lvlText w:val="%2."/>
+      <w:lvlJc w:val="left"/>
+      <w:pPr>
+        <w:ind w:left="1440" w:hanging="360"/>
+      </w:pPr>
+    </w:lvl>
+    <w:lvl w:ilvl="2" w:tplc="0809001B" w:tentative="1">
+      <w:start w:val="1"/>
+      <w:numFmt w:val="lowerRoman"/>
+      <w:lvlText w:val="%3."/>
+      <w:lvlJc w:val="right"/>
+      <w:pPr>
+        <w:ind w:left="2160" w:hanging="180"/>
+      </w:pPr>
+    </w:lvl>
+    <w:lvl w:ilvl="3" w:tplc="0809000F" w:tentative="1">
+      <w:start w:val="1"/>
+      <w:numFmt w:val="decimal"/>
+      <w:lvlText w:val="%4."/>
+      <w:lvlJc w:val="left"/>
+      <w:pPr>
+        <w:ind w:left="2880" w:hanging="360"/>
+      </w:pPr>
+    </w:lvl>
+    <w:lvl w:ilvl="4" w:tplc="08090019" w:tentative="1">
+      <w:start w:val="1"/>
+      <w:numFmt w:val="lowerLetter"/>
+      <w:lvlText w:val="%5."/>
+      <w:lvlJc w:val="left"/>
+      <w:pPr>
+        <w:ind w:left="3600" w:hanging="360"/>
+      </w:pPr>
+    </w:lvl>
+    <w:lvl w:ilvl="5" w:tplc="0809001B" w:tentative="1">
+      <w:start w:val="1"/>
+      <w:numFmt w:val="lowerRoman"/>
+      <w:lvlText w:val="%6."/>
+      <w:lvlJc w:val="right"/>
+      <w:pPr>
+        <w:ind w:left="4320" w:hanging="180"/>
+      </w:pPr>
+    </w:lvl>
+    <w:lvl w:ilvl="6" w:tplc="0809000F" w:tentative="1">
+      <w:start w:val="1"/>
+      <w:numFmt w:val="decimal"/>
+      <w:lvlText w:val="%7."/>
+      <w:lvlJc w:val="left"/>
+      <w:pPr>
+        <w:ind w:left="5040" w:hanging="360"/>
+      </w:pPr>
+    </w:lvl>
+    <w:lvl w:ilvl="7" w:tplc="08090019" w:tentative="1">
+      <w:start w:val="1"/>
+      <w:numFmt w:val="lowerLetter"/>
+      <w:lvlText w:val="%8."/>
+      <w:lvlJc w:val="left"/>
+      <w:pPr>
+        <w:ind w:left="5760" w:hanging="360"/>
+      </w:pPr>
+    </w:lvl>
+    <w:lvl w:ilvl="8" w:tplc="0809001B" w:tentative="1">
+      <w:start w:val="1"/>
+      <w:numFmt w:val="lowerRoman"/>
+      <w:lvlText w:val="%9."/>
+      <w:lvlJc w:val="right"/>
+      <w:pPr>
+        <w:ind w:left="6480" w:hanging="180"/>
+      </w:pPr>
+    </w:lvl>
+  </w:abstractNum>
   <w:num w:numId="1" w16cid:durableId="1000693501">
     <w:abstractNumId w:val="8"/>
   </w:num>
@@ -3898,6 +4072,9 @@
   </w:num>
   <w:num w:numId="9" w16cid:durableId="1892301417">
     <w:abstractNumId w:val="0"/>
+  </w:num>
+  <w:num w:numId="10" w16cid:durableId="1317421041">
+    <w:abstractNumId w:val="9"/>
   </w:num>
 </w:numbering>
 </file>
@@ -15281,6 +15458,19 @@
       </w:tcPr>
     </w:tblStylePr>
   </w:style>
+  <w:style w:type="paragraph" w:styleId="NormalWeb">
+    <w:name w:val="Normal (Web)"/>
+    <w:basedOn w:val="Normal"/>
+    <w:uiPriority w:val="99"/>
+    <w:semiHidden/>
+    <w:unhideWhenUsed/>
+    <w:rsid w:val="00DF6F11"/>
+    <w:rPr>
+      <w:rFonts w:ascii="Times New Roman" w:hAnsi="Times New Roman" w:cs="Times New Roman"/>
+      <w:sz w:val="24"/>
+      <w:szCs w:val="24"/>
+    </w:rPr>
+  </w:style>
 </w:styles>
 </file>
 

</xml_diff>